<commit_message>
fixed figure 1 and table one with uganda update of index case!
</commit_message>
<xml_diff>
--- a/fig/table_1.docx
+++ b/fig/table_1.docx
@@ -345,7 +345,7 @@
       </w:tr>
       <w:tr>
         <w:trPr>
-          <w:trHeight w:val="577" w:hRule="auto"/>
+          <w:trHeight w:val="618" w:hRule="auto"/>
         </w:trPr>
         body 1
         <w:tc>
@@ -396,7 +396,7 @@
                 <w:szCs w:val="20"/>
                 <w:color w:val="000000"/>
               </w:rPr>
-              <w:t xml:space="preserve">2011</w:t>
+              <w:t xml:space="preserve">2010</w:t>
             </w:r>
           </w:p>
         </w:tc>
@@ -448,7 +448,7 @@
                 <w:szCs w:val="20"/>
                 <w:color w:val="000000"/>
               </w:rPr>
-              <w:t xml:space="preserve">Sierra Leone</w:t>
+              <w:t xml:space="preserve">Uganda</w:t>
             </w:r>
           </w:p>
         </w:tc>
@@ -500,7 +500,7 @@
                 <w:szCs w:val="20"/>
                 <w:color w:val="000000"/>
               </w:rPr>
-              <w:t xml:space="preserve">47</w:t>
+              <w:t xml:space="preserve">110</w:t>
             </w:r>
           </w:p>
         </w:tc>
@@ -552,7 +552,7 @@
                 <w:szCs w:val="20"/>
                 <w:color w:val="000000"/>
               </w:rPr>
-              <w:t xml:space="preserve">2</w:t>
+              <w:t xml:space="preserve">273</w:t>
             </w:r>
           </w:p>
         </w:tc>
@@ -604,7 +604,7 @@
                 <w:szCs w:val="20"/>
                 <w:color w:val="000000"/>
               </w:rPr>
-              <w:t xml:space="preserve">Unknown</w:t>
+              <w:t xml:space="preserve">58</w:t>
             </w:r>
           </w:p>
         </w:tc>
@@ -656,7 +656,7 @@
                 <w:szCs w:val="20"/>
                 <w:color w:val="000000"/>
               </w:rPr>
-              <w:t xml:space="preserve">Unknown</w:t>
+              <w:t xml:space="preserve">0.21</w:t>
             </w:r>
           </w:p>
         </w:tc>
@@ -766,215 +766,215 @@
                 <w:szCs w:val="20"/>
                 <w:color w:val="000000"/>
               </w:rPr>
-              <w:t xml:space="preserve">Ghana</w:t>
-            </w:r>
-          </w:p>
-        </w:tc>
-        <w:tc>
-          <w:tcPr>
-            <w:tcBorders>
-              <w:bottom w:val="none" w:sz="0" w:space="0" w:color="000000"/>
-              <w:top w:val="none" w:sz="0" w:space="0" w:color="000000"/>
-              <w:left w:val="none" w:sz="0" w:space="0" w:color="000000"/>
-              <w:right w:val="none" w:sz="0" w:space="0" w:color="000000"/>
-            </w:tcBorders>
-            <w:shd w:val="clear" w:color="auto" w:fill="FFFFFF"/>
-            <w:tcMar>
-              <w:top w:w="0" w:type="dxa"/>
-              <w:bottom w:w="0" w:type="dxa"/>
-              <w:left w:w="0" w:type="dxa"/>
-              <w:right w:w="0" w:type="dxa"/>
-            </w:tcMar>
-            <w:vAlign w:val="center"/>
-          </w:tcPr>
-          <w:p>
-            <w:pPr>
-              <w:jc w:val="center"/>
-              <w:pBdr>
-                <w:bottom w:val="none" w:sz="0" w:space="0" w:color="000000"/>
-                <w:top w:val="none" w:sz="0" w:space="0" w:color="000000"/>
-                <w:left w:val="none" w:sz="0" w:space="0" w:color="000000"/>
-                <w:right w:val="none" w:sz="0" w:space="0" w:color="000000"/>
-              </w:pBdr>
-              <w:spacing w:after="100" w:before="100" w:line="240"/>
-              <w:ind w:left="100" w:right="100" w:firstLine="0" w:firstLineChars="0"/>
-              <w:rPr>
-                <w:rFonts w:ascii="Helvetica" w:hAnsi="Helvetica" w:eastAsia="Helvetica" w:cs="Helvetica"/>
-                <w:i w:val="false"/>
-                <w:b w:val="false"/>
-                <w:u w:val="none"/>
-                <w:sz w:val="20"/>
-                <w:szCs w:val="20"/>
-                <w:color w:val="000000"/>
-              </w:rPr>
-            </w:pPr>
-            <w:r>
-              <w:rPr>
-                <w:rFonts w:ascii="Helvetica" w:hAnsi="Helvetica" w:eastAsia="Helvetica" w:cs="Helvetica"/>
-                <w:i w:val="false"/>
-                <w:b w:val="false"/>
-                <w:u w:val="none"/>
-                <w:sz w:val="20"/>
-                <w:szCs w:val="20"/>
-                <w:color w:val="000000"/>
-              </w:rPr>
-              <w:t xml:space="preserve">42</w:t>
-            </w:r>
-          </w:p>
-        </w:tc>
-        <w:tc>
-          <w:tcPr>
-            <w:tcBorders>
-              <w:bottom w:val="none" w:sz="0" w:space="0" w:color="000000"/>
-              <w:top w:val="none" w:sz="0" w:space="0" w:color="000000"/>
-              <w:left w:val="none" w:sz="0" w:space="0" w:color="000000"/>
-              <w:right w:val="none" w:sz="0" w:space="0" w:color="000000"/>
-            </w:tcBorders>
-            <w:shd w:val="clear" w:color="auto" w:fill="FFFFFF"/>
-            <w:tcMar>
-              <w:top w:w="0" w:type="dxa"/>
-              <w:bottom w:w="0" w:type="dxa"/>
-              <w:left w:w="0" w:type="dxa"/>
-              <w:right w:w="0" w:type="dxa"/>
-            </w:tcMar>
-            <w:vAlign w:val="center"/>
-          </w:tcPr>
-          <w:p>
-            <w:pPr>
-              <w:jc w:val="center"/>
-              <w:pBdr>
-                <w:bottom w:val="none" w:sz="0" w:space="0" w:color="000000"/>
-                <w:top w:val="none" w:sz="0" w:space="0" w:color="000000"/>
-                <w:left w:val="none" w:sz="0" w:space="0" w:color="000000"/>
-                <w:right w:val="none" w:sz="0" w:space="0" w:color="000000"/>
-              </w:pBdr>
-              <w:spacing w:after="100" w:before="100" w:line="240"/>
-              <w:ind w:left="100" w:right="100" w:firstLine="0" w:firstLineChars="0"/>
-              <w:rPr>
-                <w:rFonts w:ascii="Helvetica" w:hAnsi="Helvetica" w:eastAsia="Helvetica" w:cs="Helvetica"/>
-                <w:i w:val="false"/>
-                <w:b w:val="false"/>
-                <w:u w:val="none"/>
-                <w:sz w:val="20"/>
-                <w:szCs w:val="20"/>
-                <w:color w:val="000000"/>
-              </w:rPr>
-            </w:pPr>
-            <w:r>
-              <w:rPr>
-                <w:rFonts w:ascii="Helvetica" w:hAnsi="Helvetica" w:eastAsia="Helvetica" w:cs="Helvetica"/>
-                <w:i w:val="false"/>
-                <w:b w:val="false"/>
-                <w:u w:val="none"/>
-                <w:sz w:val="20"/>
-                <w:szCs w:val="20"/>
-                <w:color w:val="000000"/>
-              </w:rPr>
-              <w:t xml:space="preserve">4</w:t>
-            </w:r>
-          </w:p>
-        </w:tc>
-        <w:tc>
-          <w:tcPr>
-            <w:tcBorders>
-              <w:bottom w:val="none" w:sz="0" w:space="0" w:color="000000"/>
-              <w:top w:val="none" w:sz="0" w:space="0" w:color="000000"/>
-              <w:left w:val="none" w:sz="0" w:space="0" w:color="000000"/>
-              <w:right w:val="none" w:sz="0" w:space="0" w:color="000000"/>
-            </w:tcBorders>
-            <w:shd w:val="clear" w:color="auto" w:fill="FFFFFF"/>
-            <w:tcMar>
-              <w:top w:w="0" w:type="dxa"/>
-              <w:bottom w:w="0" w:type="dxa"/>
-              <w:left w:w="0" w:type="dxa"/>
-              <w:right w:w="0" w:type="dxa"/>
-            </w:tcMar>
-            <w:vAlign w:val="center"/>
-          </w:tcPr>
-          <w:p>
-            <w:pPr>
-              <w:jc w:val="center"/>
-              <w:pBdr>
-                <w:bottom w:val="none" w:sz="0" w:space="0" w:color="000000"/>
-                <w:top w:val="none" w:sz="0" w:space="0" w:color="000000"/>
-                <w:left w:val="none" w:sz="0" w:space="0" w:color="000000"/>
-                <w:right w:val="none" w:sz="0" w:space="0" w:color="000000"/>
-              </w:pBdr>
-              <w:spacing w:after="100" w:before="100" w:line="240"/>
-              <w:ind w:left="100" w:right="100" w:firstLine="0" w:firstLineChars="0"/>
-              <w:rPr>
-                <w:rFonts w:ascii="Helvetica" w:hAnsi="Helvetica" w:eastAsia="Helvetica" w:cs="Helvetica"/>
-                <w:i w:val="false"/>
-                <w:b w:val="false"/>
-                <w:u w:val="none"/>
-                <w:sz w:val="20"/>
-                <w:szCs w:val="20"/>
-                <w:color w:val="000000"/>
-              </w:rPr>
-            </w:pPr>
-            <w:r>
-              <w:rPr>
-                <w:rFonts w:ascii="Helvetica" w:hAnsi="Helvetica" w:eastAsia="Helvetica" w:cs="Helvetica"/>
-                <w:i w:val="false"/>
-                <w:b w:val="false"/>
-                <w:u w:val="none"/>
-                <w:sz w:val="20"/>
-                <w:szCs w:val="20"/>
-                <w:color w:val="000000"/>
-              </w:rPr>
-              <w:t xml:space="preserve">3</w:t>
-            </w:r>
-          </w:p>
-        </w:tc>
-        <w:tc>
-          <w:tcPr>
-            <w:tcBorders>
-              <w:bottom w:val="none" w:sz="0" w:space="0" w:color="000000"/>
-              <w:top w:val="none" w:sz="0" w:space="0" w:color="000000"/>
-              <w:left w:val="none" w:sz="0" w:space="0" w:color="000000"/>
-              <w:right w:val="none" w:sz="0" w:space="0" w:color="000000"/>
-            </w:tcBorders>
-            <w:shd w:val="clear" w:color="auto" w:fill="FFFFFF"/>
-            <w:tcMar>
-              <w:top w:w="0" w:type="dxa"/>
-              <w:bottom w:w="0" w:type="dxa"/>
-              <w:left w:w="0" w:type="dxa"/>
-              <w:right w:w="0" w:type="dxa"/>
-            </w:tcMar>
-            <w:vAlign w:val="center"/>
-          </w:tcPr>
-          <w:p>
-            <w:pPr>
-              <w:jc w:val="center"/>
-              <w:pBdr>
-                <w:bottom w:val="none" w:sz="0" w:space="0" w:color="000000"/>
-                <w:top w:val="none" w:sz="0" w:space="0" w:color="000000"/>
-                <w:left w:val="none" w:sz="0" w:space="0" w:color="000000"/>
-                <w:right w:val="none" w:sz="0" w:space="0" w:color="000000"/>
-              </w:pBdr>
-              <w:spacing w:after="100" w:before="100" w:line="240"/>
-              <w:ind w:left="100" w:right="100" w:firstLine="0" w:firstLineChars="0"/>
-              <w:rPr>
-                <w:rFonts w:ascii="Helvetica" w:hAnsi="Helvetica" w:eastAsia="Helvetica" w:cs="Helvetica"/>
-                <w:i w:val="false"/>
-                <w:b w:val="false"/>
-                <w:u w:val="none"/>
-                <w:sz w:val="20"/>
-                <w:szCs w:val="20"/>
-                <w:color w:val="000000"/>
-              </w:rPr>
-            </w:pPr>
-            <w:r>
-              <w:rPr>
-                <w:rFonts w:ascii="Helvetica" w:hAnsi="Helvetica" w:eastAsia="Helvetica" w:cs="Helvetica"/>
-                <w:i w:val="false"/>
-                <w:b w:val="false"/>
-                <w:u w:val="none"/>
-                <w:sz w:val="20"/>
-                <w:szCs w:val="20"/>
-                <w:color w:val="000000"/>
-              </w:rPr>
-              <w:t xml:space="preserve">0.75</w:t>
+              <w:t xml:space="preserve">Sierra Leone</w:t>
+            </w:r>
+          </w:p>
+        </w:tc>
+        <w:tc>
+          <w:tcPr>
+            <w:tcBorders>
+              <w:bottom w:val="none" w:sz="0" w:space="0" w:color="000000"/>
+              <w:top w:val="none" w:sz="0" w:space="0" w:color="000000"/>
+              <w:left w:val="none" w:sz="0" w:space="0" w:color="000000"/>
+              <w:right w:val="none" w:sz="0" w:space="0" w:color="000000"/>
+            </w:tcBorders>
+            <w:shd w:val="clear" w:color="auto" w:fill="FFFFFF"/>
+            <w:tcMar>
+              <w:top w:w="0" w:type="dxa"/>
+              <w:bottom w:w="0" w:type="dxa"/>
+              <w:left w:w="0" w:type="dxa"/>
+              <w:right w:w="0" w:type="dxa"/>
+            </w:tcMar>
+            <w:vAlign w:val="center"/>
+          </w:tcPr>
+          <w:p>
+            <w:pPr>
+              <w:jc w:val="center"/>
+              <w:pBdr>
+                <w:bottom w:val="none" w:sz="0" w:space="0" w:color="000000"/>
+                <w:top w:val="none" w:sz="0" w:space="0" w:color="000000"/>
+                <w:left w:val="none" w:sz="0" w:space="0" w:color="000000"/>
+                <w:right w:val="none" w:sz="0" w:space="0" w:color="000000"/>
+              </w:pBdr>
+              <w:spacing w:after="100" w:before="100" w:line="240"/>
+              <w:ind w:left="100" w:right="100" w:firstLine="0" w:firstLineChars="0"/>
+              <w:rPr>
+                <w:rFonts w:ascii="Helvetica" w:hAnsi="Helvetica" w:eastAsia="Helvetica" w:cs="Helvetica"/>
+                <w:i w:val="false"/>
+                <w:b w:val="false"/>
+                <w:u w:val="none"/>
+                <w:sz w:val="20"/>
+                <w:szCs w:val="20"/>
+                <w:color w:val="000000"/>
+              </w:rPr>
+            </w:pPr>
+            <w:r>
+              <w:rPr>
+                <w:rFonts w:ascii="Helvetica" w:hAnsi="Helvetica" w:eastAsia="Helvetica" w:cs="Helvetica"/>
+                <w:i w:val="false"/>
+                <w:b w:val="false"/>
+                <w:u w:val="none"/>
+                <w:sz w:val="20"/>
+                <w:szCs w:val="20"/>
+                <w:color w:val="000000"/>
+              </w:rPr>
+              <w:t xml:space="preserve">47</w:t>
+            </w:r>
+          </w:p>
+        </w:tc>
+        <w:tc>
+          <w:tcPr>
+            <w:tcBorders>
+              <w:bottom w:val="none" w:sz="0" w:space="0" w:color="000000"/>
+              <w:top w:val="none" w:sz="0" w:space="0" w:color="000000"/>
+              <w:left w:val="none" w:sz="0" w:space="0" w:color="000000"/>
+              <w:right w:val="none" w:sz="0" w:space="0" w:color="000000"/>
+            </w:tcBorders>
+            <w:shd w:val="clear" w:color="auto" w:fill="FFFFFF"/>
+            <w:tcMar>
+              <w:top w:w="0" w:type="dxa"/>
+              <w:bottom w:w="0" w:type="dxa"/>
+              <w:left w:w="0" w:type="dxa"/>
+              <w:right w:w="0" w:type="dxa"/>
+            </w:tcMar>
+            <w:vAlign w:val="center"/>
+          </w:tcPr>
+          <w:p>
+            <w:pPr>
+              <w:jc w:val="center"/>
+              <w:pBdr>
+                <w:bottom w:val="none" w:sz="0" w:space="0" w:color="000000"/>
+                <w:top w:val="none" w:sz="0" w:space="0" w:color="000000"/>
+                <w:left w:val="none" w:sz="0" w:space="0" w:color="000000"/>
+                <w:right w:val="none" w:sz="0" w:space="0" w:color="000000"/>
+              </w:pBdr>
+              <w:spacing w:after="100" w:before="100" w:line="240"/>
+              <w:ind w:left="100" w:right="100" w:firstLine="0" w:firstLineChars="0"/>
+              <w:rPr>
+                <w:rFonts w:ascii="Helvetica" w:hAnsi="Helvetica" w:eastAsia="Helvetica" w:cs="Helvetica"/>
+                <w:i w:val="false"/>
+                <w:b w:val="false"/>
+                <w:u w:val="none"/>
+                <w:sz w:val="20"/>
+                <w:szCs w:val="20"/>
+                <w:color w:val="000000"/>
+              </w:rPr>
+            </w:pPr>
+            <w:r>
+              <w:rPr>
+                <w:rFonts w:ascii="Helvetica" w:hAnsi="Helvetica" w:eastAsia="Helvetica" w:cs="Helvetica"/>
+                <w:i w:val="false"/>
+                <w:b w:val="false"/>
+                <w:u w:val="none"/>
+                <w:sz w:val="20"/>
+                <w:szCs w:val="20"/>
+                <w:color w:val="000000"/>
+              </w:rPr>
+              <w:t xml:space="preserve">2</w:t>
+            </w:r>
+          </w:p>
+        </w:tc>
+        <w:tc>
+          <w:tcPr>
+            <w:tcBorders>
+              <w:bottom w:val="none" w:sz="0" w:space="0" w:color="000000"/>
+              <w:top w:val="none" w:sz="0" w:space="0" w:color="000000"/>
+              <w:left w:val="none" w:sz="0" w:space="0" w:color="000000"/>
+              <w:right w:val="none" w:sz="0" w:space="0" w:color="000000"/>
+            </w:tcBorders>
+            <w:shd w:val="clear" w:color="auto" w:fill="FFFFFF"/>
+            <w:tcMar>
+              <w:top w:w="0" w:type="dxa"/>
+              <w:bottom w:w="0" w:type="dxa"/>
+              <w:left w:w="0" w:type="dxa"/>
+              <w:right w:w="0" w:type="dxa"/>
+            </w:tcMar>
+            <w:vAlign w:val="center"/>
+          </w:tcPr>
+          <w:p>
+            <w:pPr>
+              <w:jc w:val="center"/>
+              <w:pBdr>
+                <w:bottom w:val="none" w:sz="0" w:space="0" w:color="000000"/>
+                <w:top w:val="none" w:sz="0" w:space="0" w:color="000000"/>
+                <w:left w:val="none" w:sz="0" w:space="0" w:color="000000"/>
+                <w:right w:val="none" w:sz="0" w:space="0" w:color="000000"/>
+              </w:pBdr>
+              <w:spacing w:after="100" w:before="100" w:line="240"/>
+              <w:ind w:left="100" w:right="100" w:firstLine="0" w:firstLineChars="0"/>
+              <w:rPr>
+                <w:rFonts w:ascii="Helvetica" w:hAnsi="Helvetica" w:eastAsia="Helvetica" w:cs="Helvetica"/>
+                <w:i w:val="false"/>
+                <w:b w:val="false"/>
+                <w:u w:val="none"/>
+                <w:sz w:val="20"/>
+                <w:szCs w:val="20"/>
+                <w:color w:val="000000"/>
+              </w:rPr>
+            </w:pPr>
+            <w:r>
+              <w:rPr>
+                <w:rFonts w:ascii="Helvetica" w:hAnsi="Helvetica" w:eastAsia="Helvetica" w:cs="Helvetica"/>
+                <w:i w:val="false"/>
+                <w:b w:val="false"/>
+                <w:u w:val="none"/>
+                <w:sz w:val="20"/>
+                <w:szCs w:val="20"/>
+                <w:color w:val="000000"/>
+              </w:rPr>
+              <w:t xml:space="preserve">Unknown</w:t>
+            </w:r>
+          </w:p>
+        </w:tc>
+        <w:tc>
+          <w:tcPr>
+            <w:tcBorders>
+              <w:bottom w:val="none" w:sz="0" w:space="0" w:color="000000"/>
+              <w:top w:val="none" w:sz="0" w:space="0" w:color="000000"/>
+              <w:left w:val="none" w:sz="0" w:space="0" w:color="000000"/>
+              <w:right w:val="none" w:sz="0" w:space="0" w:color="000000"/>
+            </w:tcBorders>
+            <w:shd w:val="clear" w:color="auto" w:fill="FFFFFF"/>
+            <w:tcMar>
+              <w:top w:w="0" w:type="dxa"/>
+              <w:bottom w:w="0" w:type="dxa"/>
+              <w:left w:w="0" w:type="dxa"/>
+              <w:right w:w="0" w:type="dxa"/>
+            </w:tcMar>
+            <w:vAlign w:val="center"/>
+          </w:tcPr>
+          <w:p>
+            <w:pPr>
+              <w:jc w:val="center"/>
+              <w:pBdr>
+                <w:bottom w:val="none" w:sz="0" w:space="0" w:color="000000"/>
+                <w:top w:val="none" w:sz="0" w:space="0" w:color="000000"/>
+                <w:left w:val="none" w:sz="0" w:space="0" w:color="000000"/>
+                <w:right w:val="none" w:sz="0" w:space="0" w:color="000000"/>
+              </w:pBdr>
+              <w:spacing w:after="100" w:before="100" w:line="240"/>
+              <w:ind w:left="100" w:right="100" w:firstLine="0" w:firstLineChars="0"/>
+              <w:rPr>
+                <w:rFonts w:ascii="Helvetica" w:hAnsi="Helvetica" w:eastAsia="Helvetica" w:cs="Helvetica"/>
+                <w:i w:val="false"/>
+                <w:b w:val="false"/>
+                <w:u w:val="none"/>
+                <w:sz w:val="20"/>
+                <w:szCs w:val="20"/>
+                <w:color w:val="000000"/>
+              </w:rPr>
+            </w:pPr>
+            <w:r>
+              <w:rPr>
+                <w:rFonts w:ascii="Helvetica" w:hAnsi="Helvetica" w:eastAsia="Helvetica" w:cs="Helvetica"/>
+                <w:i w:val="false"/>
+                <w:b w:val="false"/>
+                <w:u w:val="none"/>
+                <w:sz w:val="20"/>
+                <w:szCs w:val="20"/>
+                <w:color w:val="000000"/>
+              </w:rPr>
+              <w:t xml:space="preserve">Unknown</w:t>
             </w:r>
           </w:p>
         </w:tc>
@@ -1032,267 +1032,267 @@
                 <w:szCs w:val="20"/>
                 <w:color w:val="000000"/>
               </w:rPr>
-              <w:t xml:space="preserve">2012</w:t>
-            </w:r>
-          </w:p>
-        </w:tc>
-        <w:tc>
-          <w:tcPr>
-            <w:tcBorders>
-              <w:bottom w:val="none" w:sz="0" w:space="0" w:color="000000"/>
-              <w:top w:val="none" w:sz="0" w:space="0" w:color="000000"/>
-              <w:left w:val="none" w:sz="0" w:space="0" w:color="000000"/>
-              <w:right w:val="none" w:sz="0" w:space="0" w:color="000000"/>
-            </w:tcBorders>
-            <w:shd w:val="clear" w:color="auto" w:fill="FFFFFF"/>
-            <w:tcMar>
-              <w:top w:w="0" w:type="dxa"/>
-              <w:bottom w:w="0" w:type="dxa"/>
-              <w:left w:w="0" w:type="dxa"/>
-              <w:right w:w="0" w:type="dxa"/>
-            </w:tcMar>
-            <w:vAlign w:val="center"/>
-          </w:tcPr>
-          <w:p>
-            <w:pPr>
-              <w:jc w:val="center"/>
-              <w:pBdr>
-                <w:bottom w:val="none" w:sz="0" w:space="0" w:color="000000"/>
-                <w:top w:val="none" w:sz="0" w:space="0" w:color="000000"/>
-                <w:left w:val="none" w:sz="0" w:space="0" w:color="000000"/>
-                <w:right w:val="none" w:sz="0" w:space="0" w:color="000000"/>
-              </w:pBdr>
-              <w:spacing w:after="100" w:before="100" w:line="240"/>
-              <w:ind w:left="100" w:right="100" w:firstLine="0" w:firstLineChars="0"/>
-              <w:rPr>
-                <w:rFonts w:ascii="Helvetica" w:hAnsi="Helvetica" w:eastAsia="Helvetica" w:cs="Helvetica"/>
-                <w:i w:val="false"/>
-                <w:b w:val="false"/>
-                <w:u w:val="none"/>
-                <w:sz w:val="20"/>
-                <w:szCs w:val="20"/>
-                <w:color w:val="000000"/>
-              </w:rPr>
-            </w:pPr>
-            <w:r>
-              <w:rPr>
-                <w:rFonts w:ascii="Helvetica" w:hAnsi="Helvetica" w:eastAsia="Helvetica" w:cs="Helvetica"/>
-                <w:i w:val="false"/>
-                <w:b w:val="false"/>
-                <w:u w:val="none"/>
-                <w:sz w:val="20"/>
-                <w:szCs w:val="20"/>
-                <w:color w:val="000000"/>
-              </w:rPr>
-              <w:t xml:space="preserve">Sudan</w:t>
-            </w:r>
-          </w:p>
-        </w:tc>
-        <w:tc>
-          <w:tcPr>
-            <w:tcBorders>
-              <w:bottom w:val="none" w:sz="0" w:space="0" w:color="000000"/>
-              <w:top w:val="none" w:sz="0" w:space="0" w:color="000000"/>
-              <w:left w:val="none" w:sz="0" w:space="0" w:color="000000"/>
-              <w:right w:val="none" w:sz="0" w:space="0" w:color="000000"/>
-            </w:tcBorders>
-            <w:shd w:val="clear" w:color="auto" w:fill="FFFFFF"/>
-            <w:tcMar>
-              <w:top w:w="0" w:type="dxa"/>
-              <w:bottom w:w="0" w:type="dxa"/>
-              <w:left w:w="0" w:type="dxa"/>
-              <w:right w:w="0" w:type="dxa"/>
-            </w:tcMar>
-            <w:vAlign w:val="center"/>
-          </w:tcPr>
-          <w:p>
-            <w:pPr>
-              <w:jc w:val="center"/>
-              <w:pBdr>
-                <w:bottom w:val="none" w:sz="0" w:space="0" w:color="000000"/>
-                <w:top w:val="none" w:sz="0" w:space="0" w:color="000000"/>
-                <w:left w:val="none" w:sz="0" w:space="0" w:color="000000"/>
-                <w:right w:val="none" w:sz="0" w:space="0" w:color="000000"/>
-              </w:pBdr>
-              <w:spacing w:after="100" w:before="100" w:line="240"/>
-              <w:ind w:left="100" w:right="100" w:firstLine="0" w:firstLineChars="0"/>
-              <w:rPr>
-                <w:rFonts w:ascii="Helvetica" w:hAnsi="Helvetica" w:eastAsia="Helvetica" w:cs="Helvetica"/>
-                <w:i w:val="false"/>
-                <w:b w:val="false"/>
-                <w:u w:val="none"/>
-                <w:sz w:val="20"/>
-                <w:szCs w:val="20"/>
-                <w:color w:val="000000"/>
-              </w:rPr>
-            </w:pPr>
-            <w:r>
-              <w:rPr>
-                <w:rFonts w:ascii="Helvetica" w:hAnsi="Helvetica" w:eastAsia="Helvetica" w:cs="Helvetica"/>
-                <w:i w:val="false"/>
-                <w:b w:val="false"/>
-                <w:u w:val="none"/>
-                <w:sz w:val="20"/>
-                <w:szCs w:val="20"/>
-                <w:color w:val="000000"/>
-              </w:rPr>
-              <w:t xml:space="preserve">80</w:t>
-            </w:r>
-          </w:p>
-        </w:tc>
-        <w:tc>
-          <w:tcPr>
-            <w:tcBorders>
-              <w:bottom w:val="none" w:sz="0" w:space="0" w:color="000000"/>
-              <w:top w:val="none" w:sz="0" w:space="0" w:color="000000"/>
-              <w:left w:val="none" w:sz="0" w:space="0" w:color="000000"/>
-              <w:right w:val="none" w:sz="0" w:space="0" w:color="000000"/>
-            </w:tcBorders>
-            <w:shd w:val="clear" w:color="auto" w:fill="FFFFFF"/>
-            <w:tcMar>
-              <w:top w:w="0" w:type="dxa"/>
-              <w:bottom w:w="0" w:type="dxa"/>
-              <w:left w:w="0" w:type="dxa"/>
-              <w:right w:w="0" w:type="dxa"/>
-            </w:tcMar>
-            <w:vAlign w:val="center"/>
-          </w:tcPr>
-          <w:p>
-            <w:pPr>
-              <w:jc w:val="center"/>
-              <w:pBdr>
-                <w:bottom w:val="none" w:sz="0" w:space="0" w:color="000000"/>
-                <w:top w:val="none" w:sz="0" w:space="0" w:color="000000"/>
-                <w:left w:val="none" w:sz="0" w:space="0" w:color="000000"/>
-                <w:right w:val="none" w:sz="0" w:space="0" w:color="000000"/>
-              </w:pBdr>
-              <w:spacing w:after="100" w:before="100" w:line="240"/>
-              <w:ind w:left="100" w:right="100" w:firstLine="0" w:firstLineChars="0"/>
-              <w:rPr>
-                <w:rFonts w:ascii="Helvetica" w:hAnsi="Helvetica" w:eastAsia="Helvetica" w:cs="Helvetica"/>
-                <w:i w:val="false"/>
-                <w:b w:val="false"/>
-                <w:u w:val="none"/>
-                <w:sz w:val="20"/>
-                <w:szCs w:val="20"/>
-                <w:color w:val="000000"/>
-              </w:rPr>
-            </w:pPr>
-            <w:r>
-              <w:rPr>
-                <w:rFonts w:ascii="Helvetica" w:hAnsi="Helvetica" w:eastAsia="Helvetica" w:cs="Helvetica"/>
-                <w:i w:val="false"/>
-                <w:b w:val="false"/>
-                <w:u w:val="none"/>
-                <w:sz w:val="20"/>
-                <w:szCs w:val="20"/>
-                <w:color w:val="000000"/>
-              </w:rPr>
-              <w:t xml:space="preserve">844</w:t>
-            </w:r>
-          </w:p>
-        </w:tc>
-        <w:tc>
-          <w:tcPr>
-            <w:tcBorders>
-              <w:bottom w:val="none" w:sz="0" w:space="0" w:color="000000"/>
-              <w:top w:val="none" w:sz="0" w:space="0" w:color="000000"/>
-              <w:left w:val="none" w:sz="0" w:space="0" w:color="000000"/>
-              <w:right w:val="none" w:sz="0" w:space="0" w:color="000000"/>
-            </w:tcBorders>
-            <w:shd w:val="clear" w:color="auto" w:fill="FFFFFF"/>
-            <w:tcMar>
-              <w:top w:w="0" w:type="dxa"/>
-              <w:bottom w:w="0" w:type="dxa"/>
-              <w:left w:w="0" w:type="dxa"/>
-              <w:right w:w="0" w:type="dxa"/>
-            </w:tcMar>
-            <w:vAlign w:val="center"/>
-          </w:tcPr>
-          <w:p>
-            <w:pPr>
-              <w:jc w:val="center"/>
-              <w:pBdr>
-                <w:bottom w:val="none" w:sz="0" w:space="0" w:color="000000"/>
-                <w:top w:val="none" w:sz="0" w:space="0" w:color="000000"/>
-                <w:left w:val="none" w:sz="0" w:space="0" w:color="000000"/>
-                <w:right w:val="none" w:sz="0" w:space="0" w:color="000000"/>
-              </w:pBdr>
-              <w:spacing w:after="100" w:before="100" w:line="240"/>
-              <w:ind w:left="100" w:right="100" w:firstLine="0" w:firstLineChars="0"/>
-              <w:rPr>
-                <w:rFonts w:ascii="Helvetica" w:hAnsi="Helvetica" w:eastAsia="Helvetica" w:cs="Helvetica"/>
-                <w:i w:val="false"/>
-                <w:b w:val="false"/>
-                <w:u w:val="none"/>
-                <w:sz w:val="20"/>
-                <w:szCs w:val="20"/>
-                <w:color w:val="000000"/>
-              </w:rPr>
-            </w:pPr>
-            <w:r>
-              <w:rPr>
-                <w:rFonts w:ascii="Helvetica" w:hAnsi="Helvetica" w:eastAsia="Helvetica" w:cs="Helvetica"/>
-                <w:i w:val="false"/>
-                <w:b w:val="false"/>
-                <w:u w:val="none"/>
-                <w:sz w:val="20"/>
-                <w:szCs w:val="20"/>
-                <w:color w:val="000000"/>
-              </w:rPr>
-              <w:t xml:space="preserve">171</w:t>
-            </w:r>
-          </w:p>
-        </w:tc>
-        <w:tc>
-          <w:tcPr>
-            <w:tcBorders>
-              <w:bottom w:val="none" w:sz="0" w:space="0" w:color="000000"/>
-              <w:top w:val="none" w:sz="0" w:space="0" w:color="000000"/>
-              <w:left w:val="none" w:sz="0" w:space="0" w:color="000000"/>
-              <w:right w:val="none" w:sz="0" w:space="0" w:color="000000"/>
-            </w:tcBorders>
-            <w:shd w:val="clear" w:color="auto" w:fill="FFFFFF"/>
-            <w:tcMar>
-              <w:top w:w="0" w:type="dxa"/>
-              <w:bottom w:w="0" w:type="dxa"/>
-              <w:left w:w="0" w:type="dxa"/>
-              <w:right w:w="0" w:type="dxa"/>
-            </w:tcMar>
-            <w:vAlign w:val="center"/>
-          </w:tcPr>
-          <w:p>
-            <w:pPr>
-              <w:jc w:val="center"/>
-              <w:pBdr>
-                <w:bottom w:val="none" w:sz="0" w:space="0" w:color="000000"/>
-                <w:top w:val="none" w:sz="0" w:space="0" w:color="000000"/>
-                <w:left w:val="none" w:sz="0" w:space="0" w:color="000000"/>
-                <w:right w:val="none" w:sz="0" w:space="0" w:color="000000"/>
-              </w:pBdr>
-              <w:spacing w:after="100" w:before="100" w:line="240"/>
-              <w:ind w:left="100" w:right="100" w:firstLine="0" w:firstLineChars="0"/>
-              <w:rPr>
-                <w:rFonts w:ascii="Helvetica" w:hAnsi="Helvetica" w:eastAsia="Helvetica" w:cs="Helvetica"/>
-                <w:i w:val="false"/>
-                <w:b w:val="false"/>
-                <w:u w:val="none"/>
-                <w:sz w:val="20"/>
-                <w:szCs w:val="20"/>
-                <w:color w:val="000000"/>
-              </w:rPr>
-            </w:pPr>
-            <w:r>
-              <w:rPr>
-                <w:rFonts w:ascii="Helvetica" w:hAnsi="Helvetica" w:eastAsia="Helvetica" w:cs="Helvetica"/>
-                <w:i w:val="false"/>
-                <w:b w:val="false"/>
-                <w:u w:val="none"/>
-                <w:sz w:val="20"/>
-                <w:szCs w:val="20"/>
-                <w:color w:val="000000"/>
-              </w:rPr>
-              <w:t xml:space="preserve">0.2</w:t>
+              <w:t xml:space="preserve">2011</w:t>
+            </w:r>
+          </w:p>
+        </w:tc>
+        <w:tc>
+          <w:tcPr>
+            <w:tcBorders>
+              <w:bottom w:val="none" w:sz="0" w:space="0" w:color="000000"/>
+              <w:top w:val="none" w:sz="0" w:space="0" w:color="000000"/>
+              <w:left w:val="none" w:sz="0" w:space="0" w:color="000000"/>
+              <w:right w:val="none" w:sz="0" w:space="0" w:color="000000"/>
+            </w:tcBorders>
+            <w:shd w:val="clear" w:color="auto" w:fill="FFFFFF"/>
+            <w:tcMar>
+              <w:top w:w="0" w:type="dxa"/>
+              <w:bottom w:w="0" w:type="dxa"/>
+              <w:left w:w="0" w:type="dxa"/>
+              <w:right w:w="0" w:type="dxa"/>
+            </w:tcMar>
+            <w:vAlign w:val="center"/>
+          </w:tcPr>
+          <w:p>
+            <w:pPr>
+              <w:jc w:val="center"/>
+              <w:pBdr>
+                <w:bottom w:val="none" w:sz="0" w:space="0" w:color="000000"/>
+                <w:top w:val="none" w:sz="0" w:space="0" w:color="000000"/>
+                <w:left w:val="none" w:sz="0" w:space="0" w:color="000000"/>
+                <w:right w:val="none" w:sz="0" w:space="0" w:color="000000"/>
+              </w:pBdr>
+              <w:spacing w:after="100" w:before="100" w:line="240"/>
+              <w:ind w:left="100" w:right="100" w:firstLine="0" w:firstLineChars="0"/>
+              <w:rPr>
+                <w:rFonts w:ascii="Helvetica" w:hAnsi="Helvetica" w:eastAsia="Helvetica" w:cs="Helvetica"/>
+                <w:i w:val="false"/>
+                <w:b w:val="false"/>
+                <w:u w:val="none"/>
+                <w:sz w:val="20"/>
+                <w:szCs w:val="20"/>
+                <w:color w:val="000000"/>
+              </w:rPr>
+            </w:pPr>
+            <w:r>
+              <w:rPr>
+                <w:rFonts w:ascii="Helvetica" w:hAnsi="Helvetica" w:eastAsia="Helvetica" w:cs="Helvetica"/>
+                <w:i w:val="false"/>
+                <w:b w:val="false"/>
+                <w:u w:val="none"/>
+                <w:sz w:val="20"/>
+                <w:szCs w:val="20"/>
+                <w:color w:val="000000"/>
+              </w:rPr>
+              <w:t xml:space="preserve">Ghana</w:t>
+            </w:r>
+          </w:p>
+        </w:tc>
+        <w:tc>
+          <w:tcPr>
+            <w:tcBorders>
+              <w:bottom w:val="none" w:sz="0" w:space="0" w:color="000000"/>
+              <w:top w:val="none" w:sz="0" w:space="0" w:color="000000"/>
+              <w:left w:val="none" w:sz="0" w:space="0" w:color="000000"/>
+              <w:right w:val="none" w:sz="0" w:space="0" w:color="000000"/>
+            </w:tcBorders>
+            <w:shd w:val="clear" w:color="auto" w:fill="FFFFFF"/>
+            <w:tcMar>
+              <w:top w:w="0" w:type="dxa"/>
+              <w:bottom w:w="0" w:type="dxa"/>
+              <w:left w:w="0" w:type="dxa"/>
+              <w:right w:w="0" w:type="dxa"/>
+            </w:tcMar>
+            <w:vAlign w:val="center"/>
+          </w:tcPr>
+          <w:p>
+            <w:pPr>
+              <w:jc w:val="center"/>
+              <w:pBdr>
+                <w:bottom w:val="none" w:sz="0" w:space="0" w:color="000000"/>
+                <w:top w:val="none" w:sz="0" w:space="0" w:color="000000"/>
+                <w:left w:val="none" w:sz="0" w:space="0" w:color="000000"/>
+                <w:right w:val="none" w:sz="0" w:space="0" w:color="000000"/>
+              </w:pBdr>
+              <w:spacing w:after="100" w:before="100" w:line="240"/>
+              <w:ind w:left="100" w:right="100" w:firstLine="0" w:firstLineChars="0"/>
+              <w:rPr>
+                <w:rFonts w:ascii="Helvetica" w:hAnsi="Helvetica" w:eastAsia="Helvetica" w:cs="Helvetica"/>
+                <w:i w:val="false"/>
+                <w:b w:val="false"/>
+                <w:u w:val="none"/>
+                <w:sz w:val="20"/>
+                <w:szCs w:val="20"/>
+                <w:color w:val="000000"/>
+              </w:rPr>
+            </w:pPr>
+            <w:r>
+              <w:rPr>
+                <w:rFonts w:ascii="Helvetica" w:hAnsi="Helvetica" w:eastAsia="Helvetica" w:cs="Helvetica"/>
+                <w:i w:val="false"/>
+                <w:b w:val="false"/>
+                <w:u w:val="none"/>
+                <w:sz w:val="20"/>
+                <w:szCs w:val="20"/>
+                <w:color w:val="000000"/>
+              </w:rPr>
+              <w:t xml:space="preserve">42</w:t>
+            </w:r>
+          </w:p>
+        </w:tc>
+        <w:tc>
+          <w:tcPr>
+            <w:tcBorders>
+              <w:bottom w:val="none" w:sz="0" w:space="0" w:color="000000"/>
+              <w:top w:val="none" w:sz="0" w:space="0" w:color="000000"/>
+              <w:left w:val="none" w:sz="0" w:space="0" w:color="000000"/>
+              <w:right w:val="none" w:sz="0" w:space="0" w:color="000000"/>
+            </w:tcBorders>
+            <w:shd w:val="clear" w:color="auto" w:fill="FFFFFF"/>
+            <w:tcMar>
+              <w:top w:w="0" w:type="dxa"/>
+              <w:bottom w:w="0" w:type="dxa"/>
+              <w:left w:w="0" w:type="dxa"/>
+              <w:right w:w="0" w:type="dxa"/>
+            </w:tcMar>
+            <w:vAlign w:val="center"/>
+          </w:tcPr>
+          <w:p>
+            <w:pPr>
+              <w:jc w:val="center"/>
+              <w:pBdr>
+                <w:bottom w:val="none" w:sz="0" w:space="0" w:color="000000"/>
+                <w:top w:val="none" w:sz="0" w:space="0" w:color="000000"/>
+                <w:left w:val="none" w:sz="0" w:space="0" w:color="000000"/>
+                <w:right w:val="none" w:sz="0" w:space="0" w:color="000000"/>
+              </w:pBdr>
+              <w:spacing w:after="100" w:before="100" w:line="240"/>
+              <w:ind w:left="100" w:right="100" w:firstLine="0" w:firstLineChars="0"/>
+              <w:rPr>
+                <w:rFonts w:ascii="Helvetica" w:hAnsi="Helvetica" w:eastAsia="Helvetica" w:cs="Helvetica"/>
+                <w:i w:val="false"/>
+                <w:b w:val="false"/>
+                <w:u w:val="none"/>
+                <w:sz w:val="20"/>
+                <w:szCs w:val="20"/>
+                <w:color w:val="000000"/>
+              </w:rPr>
+            </w:pPr>
+            <w:r>
+              <w:rPr>
+                <w:rFonts w:ascii="Helvetica" w:hAnsi="Helvetica" w:eastAsia="Helvetica" w:cs="Helvetica"/>
+                <w:i w:val="false"/>
+                <w:b w:val="false"/>
+                <w:u w:val="none"/>
+                <w:sz w:val="20"/>
+                <w:szCs w:val="20"/>
+                <w:color w:val="000000"/>
+              </w:rPr>
+              <w:t xml:space="preserve">4</w:t>
+            </w:r>
+          </w:p>
+        </w:tc>
+        <w:tc>
+          <w:tcPr>
+            <w:tcBorders>
+              <w:bottom w:val="none" w:sz="0" w:space="0" w:color="000000"/>
+              <w:top w:val="none" w:sz="0" w:space="0" w:color="000000"/>
+              <w:left w:val="none" w:sz="0" w:space="0" w:color="000000"/>
+              <w:right w:val="none" w:sz="0" w:space="0" w:color="000000"/>
+            </w:tcBorders>
+            <w:shd w:val="clear" w:color="auto" w:fill="FFFFFF"/>
+            <w:tcMar>
+              <w:top w:w="0" w:type="dxa"/>
+              <w:bottom w:w="0" w:type="dxa"/>
+              <w:left w:w="0" w:type="dxa"/>
+              <w:right w:w="0" w:type="dxa"/>
+            </w:tcMar>
+            <w:vAlign w:val="center"/>
+          </w:tcPr>
+          <w:p>
+            <w:pPr>
+              <w:jc w:val="center"/>
+              <w:pBdr>
+                <w:bottom w:val="none" w:sz="0" w:space="0" w:color="000000"/>
+                <w:top w:val="none" w:sz="0" w:space="0" w:color="000000"/>
+                <w:left w:val="none" w:sz="0" w:space="0" w:color="000000"/>
+                <w:right w:val="none" w:sz="0" w:space="0" w:color="000000"/>
+              </w:pBdr>
+              <w:spacing w:after="100" w:before="100" w:line="240"/>
+              <w:ind w:left="100" w:right="100" w:firstLine="0" w:firstLineChars="0"/>
+              <w:rPr>
+                <w:rFonts w:ascii="Helvetica" w:hAnsi="Helvetica" w:eastAsia="Helvetica" w:cs="Helvetica"/>
+                <w:i w:val="false"/>
+                <w:b w:val="false"/>
+                <w:u w:val="none"/>
+                <w:sz w:val="20"/>
+                <w:szCs w:val="20"/>
+                <w:color w:val="000000"/>
+              </w:rPr>
+            </w:pPr>
+            <w:r>
+              <w:rPr>
+                <w:rFonts w:ascii="Helvetica" w:hAnsi="Helvetica" w:eastAsia="Helvetica" w:cs="Helvetica"/>
+                <w:i w:val="false"/>
+                <w:b w:val="false"/>
+                <w:u w:val="none"/>
+                <w:sz w:val="20"/>
+                <w:szCs w:val="20"/>
+                <w:color w:val="000000"/>
+              </w:rPr>
+              <w:t xml:space="preserve">3</w:t>
+            </w:r>
+          </w:p>
+        </w:tc>
+        <w:tc>
+          <w:tcPr>
+            <w:tcBorders>
+              <w:bottom w:val="none" w:sz="0" w:space="0" w:color="000000"/>
+              <w:top w:val="none" w:sz="0" w:space="0" w:color="000000"/>
+              <w:left w:val="none" w:sz="0" w:space="0" w:color="000000"/>
+              <w:right w:val="none" w:sz="0" w:space="0" w:color="000000"/>
+            </w:tcBorders>
+            <w:shd w:val="clear" w:color="auto" w:fill="FFFFFF"/>
+            <w:tcMar>
+              <w:top w:w="0" w:type="dxa"/>
+              <w:bottom w:w="0" w:type="dxa"/>
+              <w:left w:w="0" w:type="dxa"/>
+              <w:right w:w="0" w:type="dxa"/>
+            </w:tcMar>
+            <w:vAlign w:val="center"/>
+          </w:tcPr>
+          <w:p>
+            <w:pPr>
+              <w:jc w:val="center"/>
+              <w:pBdr>
+                <w:bottom w:val="none" w:sz="0" w:space="0" w:color="000000"/>
+                <w:top w:val="none" w:sz="0" w:space="0" w:color="000000"/>
+                <w:left w:val="none" w:sz="0" w:space="0" w:color="000000"/>
+                <w:right w:val="none" w:sz="0" w:space="0" w:color="000000"/>
+              </w:pBdr>
+              <w:spacing w:after="100" w:before="100" w:line="240"/>
+              <w:ind w:left="100" w:right="100" w:firstLine="0" w:firstLineChars="0"/>
+              <w:rPr>
+                <w:rFonts w:ascii="Helvetica" w:hAnsi="Helvetica" w:eastAsia="Helvetica" w:cs="Helvetica"/>
+                <w:i w:val="false"/>
+                <w:b w:val="false"/>
+                <w:u w:val="none"/>
+                <w:sz w:val="20"/>
+                <w:szCs w:val="20"/>
+                <w:color w:val="000000"/>
+              </w:rPr>
+            </w:pPr>
+            <w:r>
+              <w:rPr>
+                <w:rFonts w:ascii="Helvetica" w:hAnsi="Helvetica" w:eastAsia="Helvetica" w:cs="Helvetica"/>
+                <w:i w:val="false"/>
+                <w:b w:val="false"/>
+                <w:u w:val="none"/>
+                <w:sz w:val="20"/>
+                <w:szCs w:val="20"/>
+                <w:color w:val="000000"/>
+              </w:rPr>
+              <w:t xml:space="preserve">0.75</w:t>
             </w:r>
           </w:p>
         </w:tc>
@@ -1350,274 +1350,274 @@
                 <w:szCs w:val="20"/>
                 <w:color w:val="000000"/>
               </w:rPr>
-              <w:t xml:space="preserve">2013</w:t>
-            </w:r>
-          </w:p>
-        </w:tc>
-        <w:tc>
-          <w:tcPr>
-            <w:tcBorders>
-              <w:bottom w:val="none" w:sz="0" w:space="0" w:color="000000"/>
-              <w:top w:val="none" w:sz="0" w:space="0" w:color="000000"/>
-              <w:left w:val="none" w:sz="0" w:space="0" w:color="000000"/>
-              <w:right w:val="none" w:sz="0" w:space="0" w:color="000000"/>
-            </w:tcBorders>
-            <w:shd w:val="clear" w:color="auto" w:fill="FFFFFF"/>
-            <w:tcMar>
-              <w:top w:w="0" w:type="dxa"/>
-              <w:bottom w:w="0" w:type="dxa"/>
-              <w:left w:w="0" w:type="dxa"/>
-              <w:right w:w="0" w:type="dxa"/>
-            </w:tcMar>
-            <w:vAlign w:val="center"/>
-          </w:tcPr>
-          <w:p>
-            <w:pPr>
-              <w:jc w:val="center"/>
-              <w:pBdr>
-                <w:bottom w:val="none" w:sz="0" w:space="0" w:color="000000"/>
-                <w:top w:val="none" w:sz="0" w:space="0" w:color="000000"/>
-                <w:left w:val="none" w:sz="0" w:space="0" w:color="000000"/>
-                <w:right w:val="none" w:sz="0" w:space="0" w:color="000000"/>
-              </w:pBdr>
-              <w:spacing w:after="100" w:before="100" w:line="240"/>
-              <w:ind w:left="100" w:right="100" w:firstLine="0" w:firstLineChars="0"/>
-              <w:rPr>
-                <w:rFonts w:ascii="Helvetica" w:hAnsi="Helvetica" w:eastAsia="Helvetica" w:cs="Helvetica"/>
-                <w:i w:val="false"/>
-                <w:b w:val="false"/>
-                <w:u w:val="none"/>
-                <w:sz w:val="20"/>
-                <w:szCs w:val="20"/>
-                <w:color w:val="000000"/>
-              </w:rPr>
-            </w:pPr>
-            <w:r>
-              <w:rPr>
-                <w:rFonts w:ascii="Helvetica" w:hAnsi="Helvetica" w:eastAsia="Helvetica" w:cs="Helvetica"/>
-                <w:i w:val="false"/>
-                <w:b w:val="false"/>
-                <w:u w:val="none"/>
-                <w:sz w:val="20"/>
-                <w:szCs w:val="20"/>
-                <w:color w:val="000000"/>
-              </w:rPr>
-              <w:t xml:space="preserve">DRC</w:t>
-            </w:r>
-          </w:p>
-        </w:tc>
-        <w:tc>
-          <w:tcPr>
-            <w:tcBorders>
-              <w:bottom w:val="none" w:sz="0" w:space="0" w:color="000000"/>
-              <w:top w:val="none" w:sz="0" w:space="0" w:color="000000"/>
-              <w:left w:val="none" w:sz="0" w:space="0" w:color="000000"/>
-              <w:right w:val="none" w:sz="0" w:space="0" w:color="000000"/>
-            </w:tcBorders>
-            <w:shd w:val="clear" w:color="auto" w:fill="FFFFFF"/>
-            <w:tcMar>
-              <w:top w:w="0" w:type="dxa"/>
-              <w:bottom w:w="0" w:type="dxa"/>
-              <w:left w:w="0" w:type="dxa"/>
-              <w:right w:w="0" w:type="dxa"/>
-            </w:tcMar>
-            <w:vAlign w:val="center"/>
-          </w:tcPr>
-          <w:p>
-            <w:pPr>
-              <w:jc w:val="center"/>
-              <w:pBdr>
-                <w:bottom w:val="none" w:sz="0" w:space="0" w:color="000000"/>
-                <w:top w:val="none" w:sz="0" w:space="0" w:color="000000"/>
-                <w:left w:val="none" w:sz="0" w:space="0" w:color="000000"/>
-                <w:right w:val="none" w:sz="0" w:space="0" w:color="000000"/>
-              </w:pBdr>
-              <w:spacing w:after="100" w:before="100" w:line="240"/>
-              <w:ind w:left="100" w:right="100" w:firstLine="0" w:firstLineChars="0"/>
-              <w:rPr>
-                <w:rFonts w:ascii="Helvetica" w:hAnsi="Helvetica" w:eastAsia="Helvetica" w:cs="Helvetica"/>
-                <w:i w:val="false"/>
-                <w:b w:val="false"/>
-                <w:u w:val="none"/>
-                <w:sz w:val="20"/>
-                <w:szCs w:val="20"/>
-                <w:color w:val="000000"/>
-              </w:rPr>
-            </w:pPr>
-            <w:r>
-              <w:rPr>
-                <w:rFonts w:ascii="Helvetica" w:hAnsi="Helvetica" w:eastAsia="Helvetica" w:cs="Helvetica"/>
-                <w:i w:val="false"/>
-                <w:b w:val="false"/>
-                <w:u w:val="none"/>
-                <w:sz w:val="20"/>
-                <w:szCs w:val="20"/>
-                <w:color w:val="000000"/>
-              </w:rPr>
-              <w:t xml:space="preserve">111</w:t>
-            </w:r>
-          </w:p>
-        </w:tc>
-        <w:tc>
-          <w:tcPr>
-            <w:tcBorders>
-              <w:bottom w:val="none" w:sz="0" w:space="0" w:color="000000"/>
-              <w:top w:val="none" w:sz="0" w:space="0" w:color="000000"/>
-              <w:left w:val="none" w:sz="0" w:space="0" w:color="000000"/>
-              <w:right w:val="none" w:sz="0" w:space="0" w:color="000000"/>
-            </w:tcBorders>
-            <w:shd w:val="clear" w:color="auto" w:fill="FFFFFF"/>
-            <w:tcMar>
-              <w:top w:w="0" w:type="dxa"/>
-              <w:bottom w:w="0" w:type="dxa"/>
-              <w:left w:w="0" w:type="dxa"/>
-              <w:right w:w="0" w:type="dxa"/>
-            </w:tcMar>
-            <w:vAlign w:val="center"/>
-          </w:tcPr>
-          <w:p>
-            <w:pPr>
-              <w:jc w:val="center"/>
-              <w:pBdr>
-                <w:bottom w:val="none" w:sz="0" w:space="0" w:color="000000"/>
-                <w:top w:val="none" w:sz="0" w:space="0" w:color="000000"/>
-                <w:left w:val="none" w:sz="0" w:space="0" w:color="000000"/>
-                <w:right w:val="none" w:sz="0" w:space="0" w:color="000000"/>
-              </w:pBdr>
-              <w:spacing w:after="100" w:before="100" w:line="240"/>
-              <w:ind w:left="100" w:right="100" w:firstLine="0" w:firstLineChars="0"/>
-              <w:rPr>
-                <w:rFonts w:ascii="Helvetica" w:hAnsi="Helvetica" w:eastAsia="Helvetica" w:cs="Helvetica"/>
-                <w:i w:val="false"/>
-                <w:b w:val="false"/>
-                <w:u w:val="none"/>
-                <w:sz w:val="20"/>
-                <w:szCs w:val="20"/>
-                <w:color w:val="000000"/>
-              </w:rPr>
-            </w:pPr>
-            <w:r>
-              <w:rPr>
-                <w:rFonts w:ascii="Helvetica" w:hAnsi="Helvetica" w:eastAsia="Helvetica" w:cs="Helvetica"/>
-                <w:i w:val="false"/>
-                <w:b w:val="false"/>
-                <w:u w:val="none"/>
-                <w:sz w:val="20"/>
-                <w:szCs w:val="20"/>
-                <w:color w:val="000000"/>
-              </w:rPr>
-              <w:t xml:space="preserve">6</w:t>
-            </w:r>
-          </w:p>
-        </w:tc>
-        <w:tc>
-          <w:tcPr>
-            <w:tcBorders>
-              <w:bottom w:val="none" w:sz="0" w:space="0" w:color="000000"/>
-              <w:top w:val="none" w:sz="0" w:space="0" w:color="000000"/>
-              <w:left w:val="none" w:sz="0" w:space="0" w:color="000000"/>
-              <w:right w:val="none" w:sz="0" w:space="0" w:color="000000"/>
-            </w:tcBorders>
-            <w:shd w:val="clear" w:color="auto" w:fill="FFFFFF"/>
-            <w:tcMar>
-              <w:top w:w="0" w:type="dxa"/>
-              <w:bottom w:w="0" w:type="dxa"/>
-              <w:left w:w="0" w:type="dxa"/>
-              <w:right w:w="0" w:type="dxa"/>
-            </w:tcMar>
-            <w:vAlign w:val="center"/>
-          </w:tcPr>
-          <w:p>
-            <w:pPr>
-              <w:jc w:val="center"/>
-              <w:pBdr>
-                <w:bottom w:val="none" w:sz="0" w:space="0" w:color="000000"/>
-                <w:top w:val="none" w:sz="0" w:space="0" w:color="000000"/>
-                <w:left w:val="none" w:sz="0" w:space="0" w:color="000000"/>
-                <w:right w:val="none" w:sz="0" w:space="0" w:color="000000"/>
-              </w:pBdr>
-              <w:spacing w:after="100" w:before="100" w:line="240"/>
-              <w:ind w:left="100" w:right="100" w:firstLine="0" w:firstLineChars="0"/>
-              <w:rPr>
-                <w:rFonts w:ascii="Helvetica" w:hAnsi="Helvetica" w:eastAsia="Helvetica" w:cs="Helvetica"/>
-                <w:i w:val="false"/>
-                <w:b w:val="false"/>
-                <w:u w:val="none"/>
-                <w:sz w:val="20"/>
-                <w:szCs w:val="20"/>
-                <w:color w:val="000000"/>
-              </w:rPr>
-            </w:pPr>
-            <w:r>
-              <w:rPr>
-                <w:rFonts w:ascii="Helvetica" w:hAnsi="Helvetica" w:eastAsia="Helvetica" w:cs="Helvetica"/>
-                <w:i w:val="false"/>
-                <w:b w:val="false"/>
-                <w:u w:val="none"/>
-                <w:sz w:val="20"/>
-                <w:szCs w:val="20"/>
-                <w:color w:val="000000"/>
-              </w:rPr>
-              <w:t xml:space="preserve">0</w:t>
-            </w:r>
-          </w:p>
-        </w:tc>
-        <w:tc>
-          <w:tcPr>
-            <w:tcBorders>
-              <w:bottom w:val="none" w:sz="0" w:space="0" w:color="000000"/>
-              <w:top w:val="none" w:sz="0" w:space="0" w:color="000000"/>
-              <w:left w:val="none" w:sz="0" w:space="0" w:color="000000"/>
-              <w:right w:val="none" w:sz="0" w:space="0" w:color="000000"/>
-            </w:tcBorders>
-            <w:shd w:val="clear" w:color="auto" w:fill="FFFFFF"/>
-            <w:tcMar>
-              <w:top w:w="0" w:type="dxa"/>
-              <w:bottom w:w="0" w:type="dxa"/>
-              <w:left w:w="0" w:type="dxa"/>
-              <w:right w:w="0" w:type="dxa"/>
-            </w:tcMar>
-            <w:vAlign w:val="center"/>
-          </w:tcPr>
-          <w:p>
-            <w:pPr>
-              <w:jc w:val="center"/>
-              <w:pBdr>
-                <w:bottom w:val="none" w:sz="0" w:space="0" w:color="000000"/>
-                <w:top w:val="none" w:sz="0" w:space="0" w:color="000000"/>
-                <w:left w:val="none" w:sz="0" w:space="0" w:color="000000"/>
-                <w:right w:val="none" w:sz="0" w:space="0" w:color="000000"/>
-              </w:pBdr>
-              <w:spacing w:after="100" w:before="100" w:line="240"/>
-              <w:ind w:left="100" w:right="100" w:firstLine="0" w:firstLineChars="0"/>
-              <w:rPr>
-                <w:rFonts w:ascii="Helvetica" w:hAnsi="Helvetica" w:eastAsia="Helvetica" w:cs="Helvetica"/>
-                <w:i w:val="false"/>
-                <w:b w:val="false"/>
-                <w:u w:val="none"/>
-                <w:sz w:val="20"/>
-                <w:szCs w:val="20"/>
-                <w:color w:val="000000"/>
-              </w:rPr>
-            </w:pPr>
-            <w:r>
-              <w:rPr>
-                <w:rFonts w:ascii="Helvetica" w:hAnsi="Helvetica" w:eastAsia="Helvetica" w:cs="Helvetica"/>
-                <w:i w:val="false"/>
-                <w:b w:val="false"/>
-                <w:u w:val="none"/>
-                <w:sz w:val="20"/>
-                <w:szCs w:val="20"/>
-                <w:color w:val="000000"/>
-              </w:rPr>
-              <w:t xml:space="preserve">0</w:t>
+              <w:t xml:space="preserve">2012</w:t>
+            </w:r>
+          </w:p>
+        </w:tc>
+        <w:tc>
+          <w:tcPr>
+            <w:tcBorders>
+              <w:bottom w:val="none" w:sz="0" w:space="0" w:color="000000"/>
+              <w:top w:val="none" w:sz="0" w:space="0" w:color="000000"/>
+              <w:left w:val="none" w:sz="0" w:space="0" w:color="000000"/>
+              <w:right w:val="none" w:sz="0" w:space="0" w:color="000000"/>
+            </w:tcBorders>
+            <w:shd w:val="clear" w:color="auto" w:fill="FFFFFF"/>
+            <w:tcMar>
+              <w:top w:w="0" w:type="dxa"/>
+              <w:bottom w:w="0" w:type="dxa"/>
+              <w:left w:w="0" w:type="dxa"/>
+              <w:right w:w="0" w:type="dxa"/>
+            </w:tcMar>
+            <w:vAlign w:val="center"/>
+          </w:tcPr>
+          <w:p>
+            <w:pPr>
+              <w:jc w:val="center"/>
+              <w:pBdr>
+                <w:bottom w:val="none" w:sz="0" w:space="0" w:color="000000"/>
+                <w:top w:val="none" w:sz="0" w:space="0" w:color="000000"/>
+                <w:left w:val="none" w:sz="0" w:space="0" w:color="000000"/>
+                <w:right w:val="none" w:sz="0" w:space="0" w:color="000000"/>
+              </w:pBdr>
+              <w:spacing w:after="100" w:before="100" w:line="240"/>
+              <w:ind w:left="100" w:right="100" w:firstLine="0" w:firstLineChars="0"/>
+              <w:rPr>
+                <w:rFonts w:ascii="Helvetica" w:hAnsi="Helvetica" w:eastAsia="Helvetica" w:cs="Helvetica"/>
+                <w:i w:val="false"/>
+                <w:b w:val="false"/>
+                <w:u w:val="none"/>
+                <w:sz w:val="20"/>
+                <w:szCs w:val="20"/>
+                <w:color w:val="000000"/>
+              </w:rPr>
+            </w:pPr>
+            <w:r>
+              <w:rPr>
+                <w:rFonts w:ascii="Helvetica" w:hAnsi="Helvetica" w:eastAsia="Helvetica" w:cs="Helvetica"/>
+                <w:i w:val="false"/>
+                <w:b w:val="false"/>
+                <w:u w:val="none"/>
+                <w:sz w:val="20"/>
+                <w:szCs w:val="20"/>
+                <w:color w:val="000000"/>
+              </w:rPr>
+              <w:t xml:space="preserve">Sudan</w:t>
+            </w:r>
+          </w:p>
+        </w:tc>
+        <w:tc>
+          <w:tcPr>
+            <w:tcBorders>
+              <w:bottom w:val="none" w:sz="0" w:space="0" w:color="000000"/>
+              <w:top w:val="none" w:sz="0" w:space="0" w:color="000000"/>
+              <w:left w:val="none" w:sz="0" w:space="0" w:color="000000"/>
+              <w:right w:val="none" w:sz="0" w:space="0" w:color="000000"/>
+            </w:tcBorders>
+            <w:shd w:val="clear" w:color="auto" w:fill="FFFFFF"/>
+            <w:tcMar>
+              <w:top w:w="0" w:type="dxa"/>
+              <w:bottom w:w="0" w:type="dxa"/>
+              <w:left w:w="0" w:type="dxa"/>
+              <w:right w:w="0" w:type="dxa"/>
+            </w:tcMar>
+            <w:vAlign w:val="center"/>
+          </w:tcPr>
+          <w:p>
+            <w:pPr>
+              <w:jc w:val="center"/>
+              <w:pBdr>
+                <w:bottom w:val="none" w:sz="0" w:space="0" w:color="000000"/>
+                <w:top w:val="none" w:sz="0" w:space="0" w:color="000000"/>
+                <w:left w:val="none" w:sz="0" w:space="0" w:color="000000"/>
+                <w:right w:val="none" w:sz="0" w:space="0" w:color="000000"/>
+              </w:pBdr>
+              <w:spacing w:after="100" w:before="100" w:line="240"/>
+              <w:ind w:left="100" w:right="100" w:firstLine="0" w:firstLineChars="0"/>
+              <w:rPr>
+                <w:rFonts w:ascii="Helvetica" w:hAnsi="Helvetica" w:eastAsia="Helvetica" w:cs="Helvetica"/>
+                <w:i w:val="false"/>
+                <w:b w:val="false"/>
+                <w:u w:val="none"/>
+                <w:sz w:val="20"/>
+                <w:szCs w:val="20"/>
+                <w:color w:val="000000"/>
+              </w:rPr>
+            </w:pPr>
+            <w:r>
+              <w:rPr>
+                <w:rFonts w:ascii="Helvetica" w:hAnsi="Helvetica" w:eastAsia="Helvetica" w:cs="Helvetica"/>
+                <w:i w:val="false"/>
+                <w:b w:val="false"/>
+                <w:u w:val="none"/>
+                <w:sz w:val="20"/>
+                <w:szCs w:val="20"/>
+                <w:color w:val="000000"/>
+              </w:rPr>
+              <w:t xml:space="preserve">80</w:t>
+            </w:r>
+          </w:p>
+        </w:tc>
+        <w:tc>
+          <w:tcPr>
+            <w:tcBorders>
+              <w:bottom w:val="none" w:sz="0" w:space="0" w:color="000000"/>
+              <w:top w:val="none" w:sz="0" w:space="0" w:color="000000"/>
+              <w:left w:val="none" w:sz="0" w:space="0" w:color="000000"/>
+              <w:right w:val="none" w:sz="0" w:space="0" w:color="000000"/>
+            </w:tcBorders>
+            <w:shd w:val="clear" w:color="auto" w:fill="FFFFFF"/>
+            <w:tcMar>
+              <w:top w:w="0" w:type="dxa"/>
+              <w:bottom w:w="0" w:type="dxa"/>
+              <w:left w:w="0" w:type="dxa"/>
+              <w:right w:w="0" w:type="dxa"/>
+            </w:tcMar>
+            <w:vAlign w:val="center"/>
+          </w:tcPr>
+          <w:p>
+            <w:pPr>
+              <w:jc w:val="center"/>
+              <w:pBdr>
+                <w:bottom w:val="none" w:sz="0" w:space="0" w:color="000000"/>
+                <w:top w:val="none" w:sz="0" w:space="0" w:color="000000"/>
+                <w:left w:val="none" w:sz="0" w:space="0" w:color="000000"/>
+                <w:right w:val="none" w:sz="0" w:space="0" w:color="000000"/>
+              </w:pBdr>
+              <w:spacing w:after="100" w:before="100" w:line="240"/>
+              <w:ind w:left="100" w:right="100" w:firstLine="0" w:firstLineChars="0"/>
+              <w:rPr>
+                <w:rFonts w:ascii="Helvetica" w:hAnsi="Helvetica" w:eastAsia="Helvetica" w:cs="Helvetica"/>
+                <w:i w:val="false"/>
+                <w:b w:val="false"/>
+                <w:u w:val="none"/>
+                <w:sz w:val="20"/>
+                <w:szCs w:val="20"/>
+                <w:color w:val="000000"/>
+              </w:rPr>
+            </w:pPr>
+            <w:r>
+              <w:rPr>
+                <w:rFonts w:ascii="Helvetica" w:hAnsi="Helvetica" w:eastAsia="Helvetica" w:cs="Helvetica"/>
+                <w:i w:val="false"/>
+                <w:b w:val="false"/>
+                <w:u w:val="none"/>
+                <w:sz w:val="20"/>
+                <w:szCs w:val="20"/>
+                <w:color w:val="000000"/>
+              </w:rPr>
+              <w:t xml:space="preserve">844</w:t>
+            </w:r>
+          </w:p>
+        </w:tc>
+        <w:tc>
+          <w:tcPr>
+            <w:tcBorders>
+              <w:bottom w:val="none" w:sz="0" w:space="0" w:color="000000"/>
+              <w:top w:val="none" w:sz="0" w:space="0" w:color="000000"/>
+              <w:left w:val="none" w:sz="0" w:space="0" w:color="000000"/>
+              <w:right w:val="none" w:sz="0" w:space="0" w:color="000000"/>
+            </w:tcBorders>
+            <w:shd w:val="clear" w:color="auto" w:fill="FFFFFF"/>
+            <w:tcMar>
+              <w:top w:w="0" w:type="dxa"/>
+              <w:bottom w:w="0" w:type="dxa"/>
+              <w:left w:w="0" w:type="dxa"/>
+              <w:right w:w="0" w:type="dxa"/>
+            </w:tcMar>
+            <w:vAlign w:val="center"/>
+          </w:tcPr>
+          <w:p>
+            <w:pPr>
+              <w:jc w:val="center"/>
+              <w:pBdr>
+                <w:bottom w:val="none" w:sz="0" w:space="0" w:color="000000"/>
+                <w:top w:val="none" w:sz="0" w:space="0" w:color="000000"/>
+                <w:left w:val="none" w:sz="0" w:space="0" w:color="000000"/>
+                <w:right w:val="none" w:sz="0" w:space="0" w:color="000000"/>
+              </w:pBdr>
+              <w:spacing w:after="100" w:before="100" w:line="240"/>
+              <w:ind w:left="100" w:right="100" w:firstLine="0" w:firstLineChars="0"/>
+              <w:rPr>
+                <w:rFonts w:ascii="Helvetica" w:hAnsi="Helvetica" w:eastAsia="Helvetica" w:cs="Helvetica"/>
+                <w:i w:val="false"/>
+                <w:b w:val="false"/>
+                <w:u w:val="none"/>
+                <w:sz w:val="20"/>
+                <w:szCs w:val="20"/>
+                <w:color w:val="000000"/>
+              </w:rPr>
+            </w:pPr>
+            <w:r>
+              <w:rPr>
+                <w:rFonts w:ascii="Helvetica" w:hAnsi="Helvetica" w:eastAsia="Helvetica" w:cs="Helvetica"/>
+                <w:i w:val="false"/>
+                <w:b w:val="false"/>
+                <w:u w:val="none"/>
+                <w:sz w:val="20"/>
+                <w:szCs w:val="20"/>
+                <w:color w:val="000000"/>
+              </w:rPr>
+              <w:t xml:space="preserve">171</w:t>
+            </w:r>
+          </w:p>
+        </w:tc>
+        <w:tc>
+          <w:tcPr>
+            <w:tcBorders>
+              <w:bottom w:val="none" w:sz="0" w:space="0" w:color="000000"/>
+              <w:top w:val="none" w:sz="0" w:space="0" w:color="000000"/>
+              <w:left w:val="none" w:sz="0" w:space="0" w:color="000000"/>
+              <w:right w:val="none" w:sz="0" w:space="0" w:color="000000"/>
+            </w:tcBorders>
+            <w:shd w:val="clear" w:color="auto" w:fill="FFFFFF"/>
+            <w:tcMar>
+              <w:top w:w="0" w:type="dxa"/>
+              <w:bottom w:w="0" w:type="dxa"/>
+              <w:left w:w="0" w:type="dxa"/>
+              <w:right w:w="0" w:type="dxa"/>
+            </w:tcMar>
+            <w:vAlign w:val="center"/>
+          </w:tcPr>
+          <w:p>
+            <w:pPr>
+              <w:jc w:val="center"/>
+              <w:pBdr>
+                <w:bottom w:val="none" w:sz="0" w:space="0" w:color="000000"/>
+                <w:top w:val="none" w:sz="0" w:space="0" w:color="000000"/>
+                <w:left w:val="none" w:sz="0" w:space="0" w:color="000000"/>
+                <w:right w:val="none" w:sz="0" w:space="0" w:color="000000"/>
+              </w:pBdr>
+              <w:spacing w:after="100" w:before="100" w:line="240"/>
+              <w:ind w:left="100" w:right="100" w:firstLine="0" w:firstLineChars="0"/>
+              <w:rPr>
+                <w:rFonts w:ascii="Helvetica" w:hAnsi="Helvetica" w:eastAsia="Helvetica" w:cs="Helvetica"/>
+                <w:i w:val="false"/>
+                <w:b w:val="false"/>
+                <w:u w:val="none"/>
+                <w:sz w:val="20"/>
+                <w:szCs w:val="20"/>
+                <w:color w:val="000000"/>
+              </w:rPr>
+            </w:pPr>
+            <w:r>
+              <w:rPr>
+                <w:rFonts w:ascii="Helvetica" w:hAnsi="Helvetica" w:eastAsia="Helvetica" w:cs="Helvetica"/>
+                <w:i w:val="false"/>
+                <w:b w:val="false"/>
+                <w:u w:val="none"/>
+                <w:sz w:val="20"/>
+                <w:szCs w:val="20"/>
+                <w:color w:val="000000"/>
+              </w:rPr>
+              <w:t xml:space="preserve">0.2</w:t>
             </w:r>
           </w:p>
         </w:tc>
       </w:tr>
       <w:tr>
         <w:trPr>
-          <w:trHeight w:val="605" w:hRule="auto"/>
+          <w:trHeight w:val="577" w:hRule="auto"/>
         </w:trPr>
         body 5
         <w:tc>
@@ -1720,111 +1720,111 @@
                 <w:szCs w:val="20"/>
                 <w:color w:val="000000"/>
               </w:rPr>
-              <w:t xml:space="preserve">Cameroon, Littoral</w:t>
-            </w:r>
-          </w:p>
-        </w:tc>
-        <w:tc>
-          <w:tcPr>
-            <w:tcBorders>
-              <w:bottom w:val="none" w:sz="0" w:space="0" w:color="000000"/>
-              <w:top w:val="none" w:sz="0" w:space="0" w:color="000000"/>
-              <w:left w:val="none" w:sz="0" w:space="0" w:color="000000"/>
-              <w:right w:val="none" w:sz="0" w:space="0" w:color="000000"/>
-            </w:tcBorders>
-            <w:shd w:val="clear" w:color="auto" w:fill="FFFFFF"/>
-            <w:tcMar>
-              <w:top w:w="0" w:type="dxa"/>
-              <w:bottom w:w="0" w:type="dxa"/>
-              <w:left w:w="0" w:type="dxa"/>
-              <w:right w:w="0" w:type="dxa"/>
-            </w:tcMar>
-            <w:vAlign w:val="center"/>
-          </w:tcPr>
-          <w:p>
-            <w:pPr>
-              <w:jc w:val="center"/>
-              <w:pBdr>
-                <w:bottom w:val="none" w:sz="0" w:space="0" w:color="000000"/>
-                <w:top w:val="none" w:sz="0" w:space="0" w:color="000000"/>
-                <w:left w:val="none" w:sz="0" w:space="0" w:color="000000"/>
-                <w:right w:val="none" w:sz="0" w:space="0" w:color="000000"/>
-              </w:pBdr>
-              <w:spacing w:after="100" w:before="100" w:line="240"/>
-              <w:ind w:left="100" w:right="100" w:firstLine="0" w:firstLineChars="0"/>
-              <w:rPr>
-                <w:rFonts w:ascii="Helvetica" w:hAnsi="Helvetica" w:eastAsia="Helvetica" w:cs="Helvetica"/>
-                <w:i w:val="false"/>
-                <w:b w:val="false"/>
-                <w:u w:val="none"/>
-                <w:sz w:val="20"/>
-                <w:szCs w:val="20"/>
-                <w:color w:val="000000"/>
-              </w:rPr>
-            </w:pPr>
-            <w:r>
-              <w:rPr>
-                <w:rFonts w:ascii="Helvetica" w:hAnsi="Helvetica" w:eastAsia="Helvetica" w:cs="Helvetica"/>
-                <w:i w:val="false"/>
-                <w:b w:val="false"/>
-                <w:u w:val="none"/>
-                <w:sz w:val="20"/>
-                <w:szCs w:val="20"/>
-                <w:color w:val="000000"/>
-              </w:rPr>
-              <w:t xml:space="preserve">165</w:t>
-            </w:r>
-          </w:p>
-        </w:tc>
-        <w:tc>
-          <w:tcPr>
-            <w:tcBorders>
-              <w:bottom w:val="none" w:sz="0" w:space="0" w:color="000000"/>
-              <w:top w:val="none" w:sz="0" w:space="0" w:color="000000"/>
-              <w:left w:val="none" w:sz="0" w:space="0" w:color="000000"/>
-              <w:right w:val="none" w:sz="0" w:space="0" w:color="000000"/>
-            </w:tcBorders>
-            <w:shd w:val="clear" w:color="auto" w:fill="FFFFFF"/>
-            <w:tcMar>
-              <w:top w:w="0" w:type="dxa"/>
-              <w:bottom w:w="0" w:type="dxa"/>
-              <w:left w:w="0" w:type="dxa"/>
-              <w:right w:w="0" w:type="dxa"/>
-            </w:tcMar>
-            <w:vAlign w:val="center"/>
-          </w:tcPr>
-          <w:p>
-            <w:pPr>
-              <w:jc w:val="center"/>
-              <w:pBdr>
-                <w:bottom w:val="none" w:sz="0" w:space="0" w:color="000000"/>
-                <w:top w:val="none" w:sz="0" w:space="0" w:color="000000"/>
-                <w:left w:val="none" w:sz="0" w:space="0" w:color="000000"/>
-                <w:right w:val="none" w:sz="0" w:space="0" w:color="000000"/>
-              </w:pBdr>
-              <w:spacing w:after="100" w:before="100" w:line="240"/>
-              <w:ind w:left="100" w:right="100" w:firstLine="0" w:firstLineChars="0"/>
-              <w:rPr>
-                <w:rFonts w:ascii="Helvetica" w:hAnsi="Helvetica" w:eastAsia="Helvetica" w:cs="Helvetica"/>
-                <w:i w:val="false"/>
-                <w:b w:val="false"/>
-                <w:u w:val="none"/>
-                <w:sz w:val="20"/>
-                <w:szCs w:val="20"/>
-                <w:color w:val="000000"/>
-              </w:rPr>
-            </w:pPr>
-            <w:r>
-              <w:rPr>
-                <w:rFonts w:ascii="Helvetica" w:hAnsi="Helvetica" w:eastAsia="Helvetica" w:cs="Helvetica"/>
-                <w:i w:val="false"/>
-                <w:b w:val="false"/>
-                <w:u w:val="none"/>
-                <w:sz w:val="20"/>
-                <w:szCs w:val="20"/>
-                <w:color w:val="000000"/>
-              </w:rPr>
-              <w:t xml:space="preserve">8</w:t>
+              <w:t xml:space="preserve">DRC</w:t>
+            </w:r>
+          </w:p>
+        </w:tc>
+        <w:tc>
+          <w:tcPr>
+            <w:tcBorders>
+              <w:bottom w:val="none" w:sz="0" w:space="0" w:color="000000"/>
+              <w:top w:val="none" w:sz="0" w:space="0" w:color="000000"/>
+              <w:left w:val="none" w:sz="0" w:space="0" w:color="000000"/>
+              <w:right w:val="none" w:sz="0" w:space="0" w:color="000000"/>
+            </w:tcBorders>
+            <w:shd w:val="clear" w:color="auto" w:fill="FFFFFF"/>
+            <w:tcMar>
+              <w:top w:w="0" w:type="dxa"/>
+              <w:bottom w:w="0" w:type="dxa"/>
+              <w:left w:w="0" w:type="dxa"/>
+              <w:right w:w="0" w:type="dxa"/>
+            </w:tcMar>
+            <w:vAlign w:val="center"/>
+          </w:tcPr>
+          <w:p>
+            <w:pPr>
+              <w:jc w:val="center"/>
+              <w:pBdr>
+                <w:bottom w:val="none" w:sz="0" w:space="0" w:color="000000"/>
+                <w:top w:val="none" w:sz="0" w:space="0" w:color="000000"/>
+                <w:left w:val="none" w:sz="0" w:space="0" w:color="000000"/>
+                <w:right w:val="none" w:sz="0" w:space="0" w:color="000000"/>
+              </w:pBdr>
+              <w:spacing w:after="100" w:before="100" w:line="240"/>
+              <w:ind w:left="100" w:right="100" w:firstLine="0" w:firstLineChars="0"/>
+              <w:rPr>
+                <w:rFonts w:ascii="Helvetica" w:hAnsi="Helvetica" w:eastAsia="Helvetica" w:cs="Helvetica"/>
+                <w:i w:val="false"/>
+                <w:b w:val="false"/>
+                <w:u w:val="none"/>
+                <w:sz w:val="20"/>
+                <w:szCs w:val="20"/>
+                <w:color w:val="000000"/>
+              </w:rPr>
+            </w:pPr>
+            <w:r>
+              <w:rPr>
+                <w:rFonts w:ascii="Helvetica" w:hAnsi="Helvetica" w:eastAsia="Helvetica" w:cs="Helvetica"/>
+                <w:i w:val="false"/>
+                <w:b w:val="false"/>
+                <w:u w:val="none"/>
+                <w:sz w:val="20"/>
+                <w:szCs w:val="20"/>
+                <w:color w:val="000000"/>
+              </w:rPr>
+              <w:t xml:space="preserve">111</w:t>
+            </w:r>
+          </w:p>
+        </w:tc>
+        <w:tc>
+          <w:tcPr>
+            <w:tcBorders>
+              <w:bottom w:val="none" w:sz="0" w:space="0" w:color="000000"/>
+              <w:top w:val="none" w:sz="0" w:space="0" w:color="000000"/>
+              <w:left w:val="none" w:sz="0" w:space="0" w:color="000000"/>
+              <w:right w:val="none" w:sz="0" w:space="0" w:color="000000"/>
+            </w:tcBorders>
+            <w:shd w:val="clear" w:color="auto" w:fill="FFFFFF"/>
+            <w:tcMar>
+              <w:top w:w="0" w:type="dxa"/>
+              <w:bottom w:w="0" w:type="dxa"/>
+              <w:left w:w="0" w:type="dxa"/>
+              <w:right w:w="0" w:type="dxa"/>
+            </w:tcMar>
+            <w:vAlign w:val="center"/>
+          </w:tcPr>
+          <w:p>
+            <w:pPr>
+              <w:jc w:val="center"/>
+              <w:pBdr>
+                <w:bottom w:val="none" w:sz="0" w:space="0" w:color="000000"/>
+                <w:top w:val="none" w:sz="0" w:space="0" w:color="000000"/>
+                <w:left w:val="none" w:sz="0" w:space="0" w:color="000000"/>
+                <w:right w:val="none" w:sz="0" w:space="0" w:color="000000"/>
+              </w:pBdr>
+              <w:spacing w:after="100" w:before="100" w:line="240"/>
+              <w:ind w:left="100" w:right="100" w:firstLine="0" w:firstLineChars="0"/>
+              <w:rPr>
+                <w:rFonts w:ascii="Helvetica" w:hAnsi="Helvetica" w:eastAsia="Helvetica" w:cs="Helvetica"/>
+                <w:i w:val="false"/>
+                <w:b w:val="false"/>
+                <w:u w:val="none"/>
+                <w:sz w:val="20"/>
+                <w:szCs w:val="20"/>
+                <w:color w:val="000000"/>
+              </w:rPr>
+            </w:pPr>
+            <w:r>
+              <w:rPr>
+                <w:rFonts w:ascii="Helvetica" w:hAnsi="Helvetica" w:eastAsia="Helvetica" w:cs="Helvetica"/>
+                <w:i w:val="false"/>
+                <w:b w:val="false"/>
+                <w:u w:val="none"/>
+                <w:sz w:val="20"/>
+                <w:szCs w:val="20"/>
+                <w:color w:val="000000"/>
+              </w:rPr>
+              <w:t xml:space="preserve">6</w:t>
             </w:r>
           </w:p>
         </w:tc>
@@ -2038,6 +2038,324 @@
                 <w:szCs w:val="20"/>
                 <w:color w:val="000000"/>
               </w:rPr>
+              <w:t xml:space="preserve">Cameroon, Littoral</w:t>
+            </w:r>
+          </w:p>
+        </w:tc>
+        <w:tc>
+          <w:tcPr>
+            <w:tcBorders>
+              <w:bottom w:val="none" w:sz="0" w:space="0" w:color="000000"/>
+              <w:top w:val="none" w:sz="0" w:space="0" w:color="000000"/>
+              <w:left w:val="none" w:sz="0" w:space="0" w:color="000000"/>
+              <w:right w:val="none" w:sz="0" w:space="0" w:color="000000"/>
+            </w:tcBorders>
+            <w:shd w:val="clear" w:color="auto" w:fill="FFFFFF"/>
+            <w:tcMar>
+              <w:top w:w="0" w:type="dxa"/>
+              <w:bottom w:w="0" w:type="dxa"/>
+              <w:left w:w="0" w:type="dxa"/>
+              <w:right w:w="0" w:type="dxa"/>
+            </w:tcMar>
+            <w:vAlign w:val="center"/>
+          </w:tcPr>
+          <w:p>
+            <w:pPr>
+              <w:jc w:val="center"/>
+              <w:pBdr>
+                <w:bottom w:val="none" w:sz="0" w:space="0" w:color="000000"/>
+                <w:top w:val="none" w:sz="0" w:space="0" w:color="000000"/>
+                <w:left w:val="none" w:sz="0" w:space="0" w:color="000000"/>
+                <w:right w:val="none" w:sz="0" w:space="0" w:color="000000"/>
+              </w:pBdr>
+              <w:spacing w:after="100" w:before="100" w:line="240"/>
+              <w:ind w:left="100" w:right="100" w:firstLine="0" w:firstLineChars="0"/>
+              <w:rPr>
+                <w:rFonts w:ascii="Helvetica" w:hAnsi="Helvetica" w:eastAsia="Helvetica" w:cs="Helvetica"/>
+                <w:i w:val="false"/>
+                <w:b w:val="false"/>
+                <w:u w:val="none"/>
+                <w:sz w:val="20"/>
+                <w:szCs w:val="20"/>
+                <w:color w:val="000000"/>
+              </w:rPr>
+            </w:pPr>
+            <w:r>
+              <w:rPr>
+                <w:rFonts w:ascii="Helvetica" w:hAnsi="Helvetica" w:eastAsia="Helvetica" w:cs="Helvetica"/>
+                <w:i w:val="false"/>
+                <w:b w:val="false"/>
+                <w:u w:val="none"/>
+                <w:sz w:val="20"/>
+                <w:szCs w:val="20"/>
+                <w:color w:val="000000"/>
+              </w:rPr>
+              <w:t xml:space="preserve">165</w:t>
+            </w:r>
+          </w:p>
+        </w:tc>
+        <w:tc>
+          <w:tcPr>
+            <w:tcBorders>
+              <w:bottom w:val="none" w:sz="0" w:space="0" w:color="000000"/>
+              <w:top w:val="none" w:sz="0" w:space="0" w:color="000000"/>
+              <w:left w:val="none" w:sz="0" w:space="0" w:color="000000"/>
+              <w:right w:val="none" w:sz="0" w:space="0" w:color="000000"/>
+            </w:tcBorders>
+            <w:shd w:val="clear" w:color="auto" w:fill="FFFFFF"/>
+            <w:tcMar>
+              <w:top w:w="0" w:type="dxa"/>
+              <w:bottom w:w="0" w:type="dxa"/>
+              <w:left w:w="0" w:type="dxa"/>
+              <w:right w:w="0" w:type="dxa"/>
+            </w:tcMar>
+            <w:vAlign w:val="center"/>
+          </w:tcPr>
+          <w:p>
+            <w:pPr>
+              <w:jc w:val="center"/>
+              <w:pBdr>
+                <w:bottom w:val="none" w:sz="0" w:space="0" w:color="000000"/>
+                <w:top w:val="none" w:sz="0" w:space="0" w:color="000000"/>
+                <w:left w:val="none" w:sz="0" w:space="0" w:color="000000"/>
+                <w:right w:val="none" w:sz="0" w:space="0" w:color="000000"/>
+              </w:pBdr>
+              <w:spacing w:after="100" w:before="100" w:line="240"/>
+              <w:ind w:left="100" w:right="100" w:firstLine="0" w:firstLineChars="0"/>
+              <w:rPr>
+                <w:rFonts w:ascii="Helvetica" w:hAnsi="Helvetica" w:eastAsia="Helvetica" w:cs="Helvetica"/>
+                <w:i w:val="false"/>
+                <w:b w:val="false"/>
+                <w:u w:val="none"/>
+                <w:sz w:val="20"/>
+                <w:szCs w:val="20"/>
+                <w:color w:val="000000"/>
+              </w:rPr>
+            </w:pPr>
+            <w:r>
+              <w:rPr>
+                <w:rFonts w:ascii="Helvetica" w:hAnsi="Helvetica" w:eastAsia="Helvetica" w:cs="Helvetica"/>
+                <w:i w:val="false"/>
+                <w:b w:val="false"/>
+                <w:u w:val="none"/>
+                <w:sz w:val="20"/>
+                <w:szCs w:val="20"/>
+                <w:color w:val="000000"/>
+              </w:rPr>
+              <w:t xml:space="preserve">8</w:t>
+            </w:r>
+          </w:p>
+        </w:tc>
+        <w:tc>
+          <w:tcPr>
+            <w:tcBorders>
+              <w:bottom w:val="none" w:sz="0" w:space="0" w:color="000000"/>
+              <w:top w:val="none" w:sz="0" w:space="0" w:color="000000"/>
+              <w:left w:val="none" w:sz="0" w:space="0" w:color="000000"/>
+              <w:right w:val="none" w:sz="0" w:space="0" w:color="000000"/>
+            </w:tcBorders>
+            <w:shd w:val="clear" w:color="auto" w:fill="FFFFFF"/>
+            <w:tcMar>
+              <w:top w:w="0" w:type="dxa"/>
+              <w:bottom w:w="0" w:type="dxa"/>
+              <w:left w:w="0" w:type="dxa"/>
+              <w:right w:w="0" w:type="dxa"/>
+            </w:tcMar>
+            <w:vAlign w:val="center"/>
+          </w:tcPr>
+          <w:p>
+            <w:pPr>
+              <w:jc w:val="center"/>
+              <w:pBdr>
+                <w:bottom w:val="none" w:sz="0" w:space="0" w:color="000000"/>
+                <w:top w:val="none" w:sz="0" w:space="0" w:color="000000"/>
+                <w:left w:val="none" w:sz="0" w:space="0" w:color="000000"/>
+                <w:right w:val="none" w:sz="0" w:space="0" w:color="000000"/>
+              </w:pBdr>
+              <w:spacing w:after="100" w:before="100" w:line="240"/>
+              <w:ind w:left="100" w:right="100" w:firstLine="0" w:firstLineChars="0"/>
+              <w:rPr>
+                <w:rFonts w:ascii="Helvetica" w:hAnsi="Helvetica" w:eastAsia="Helvetica" w:cs="Helvetica"/>
+                <w:i w:val="false"/>
+                <w:b w:val="false"/>
+                <w:u w:val="none"/>
+                <w:sz w:val="20"/>
+                <w:szCs w:val="20"/>
+                <w:color w:val="000000"/>
+              </w:rPr>
+            </w:pPr>
+            <w:r>
+              <w:rPr>
+                <w:rFonts w:ascii="Helvetica" w:hAnsi="Helvetica" w:eastAsia="Helvetica" w:cs="Helvetica"/>
+                <w:i w:val="false"/>
+                <w:b w:val="false"/>
+                <w:u w:val="none"/>
+                <w:sz w:val="20"/>
+                <w:szCs w:val="20"/>
+                <w:color w:val="000000"/>
+              </w:rPr>
+              <w:t xml:space="preserve">0</w:t>
+            </w:r>
+          </w:p>
+        </w:tc>
+        <w:tc>
+          <w:tcPr>
+            <w:tcBorders>
+              <w:bottom w:val="none" w:sz="0" w:space="0" w:color="000000"/>
+              <w:top w:val="none" w:sz="0" w:space="0" w:color="000000"/>
+              <w:left w:val="none" w:sz="0" w:space="0" w:color="000000"/>
+              <w:right w:val="none" w:sz="0" w:space="0" w:color="000000"/>
+            </w:tcBorders>
+            <w:shd w:val="clear" w:color="auto" w:fill="FFFFFF"/>
+            <w:tcMar>
+              <w:top w:w="0" w:type="dxa"/>
+              <w:bottom w:w="0" w:type="dxa"/>
+              <w:left w:w="0" w:type="dxa"/>
+              <w:right w:w="0" w:type="dxa"/>
+            </w:tcMar>
+            <w:vAlign w:val="center"/>
+          </w:tcPr>
+          <w:p>
+            <w:pPr>
+              <w:jc w:val="center"/>
+              <w:pBdr>
+                <w:bottom w:val="none" w:sz="0" w:space="0" w:color="000000"/>
+                <w:top w:val="none" w:sz="0" w:space="0" w:color="000000"/>
+                <w:left w:val="none" w:sz="0" w:space="0" w:color="000000"/>
+                <w:right w:val="none" w:sz="0" w:space="0" w:color="000000"/>
+              </w:pBdr>
+              <w:spacing w:after="100" w:before="100" w:line="240"/>
+              <w:ind w:left="100" w:right="100" w:firstLine="0" w:firstLineChars="0"/>
+              <w:rPr>
+                <w:rFonts w:ascii="Helvetica" w:hAnsi="Helvetica" w:eastAsia="Helvetica" w:cs="Helvetica"/>
+                <w:i w:val="false"/>
+                <w:b w:val="false"/>
+                <w:u w:val="none"/>
+                <w:sz w:val="20"/>
+                <w:szCs w:val="20"/>
+                <w:color w:val="000000"/>
+              </w:rPr>
+            </w:pPr>
+            <w:r>
+              <w:rPr>
+                <w:rFonts w:ascii="Helvetica" w:hAnsi="Helvetica" w:eastAsia="Helvetica" w:cs="Helvetica"/>
+                <w:i w:val="false"/>
+                <w:b w:val="false"/>
+                <w:u w:val="none"/>
+                <w:sz w:val="20"/>
+                <w:szCs w:val="20"/>
+                <w:color w:val="000000"/>
+              </w:rPr>
+              <w:t xml:space="preserve">0</w:t>
+            </w:r>
+          </w:p>
+        </w:tc>
+      </w:tr>
+      <w:tr>
+        <w:trPr>
+          <w:trHeight w:val="605" w:hRule="auto"/>
+        </w:trPr>
+        body 7
+        <w:tc>
+          <w:tcPr>
+            <w:tcBorders>
+              <w:bottom w:val="none" w:sz="0" w:space="0" w:color="000000"/>
+              <w:top w:val="none" w:sz="0" w:space="0" w:color="000000"/>
+              <w:left w:val="none" w:sz="0" w:space="0" w:color="000000"/>
+              <w:right w:val="none" w:sz="0" w:space="0" w:color="000000"/>
+            </w:tcBorders>
+            <w:shd w:val="clear" w:color="auto" w:fill="FFFFFF"/>
+            <w:tcMar>
+              <w:top w:w="0" w:type="dxa"/>
+              <w:bottom w:w="0" w:type="dxa"/>
+              <w:left w:w="0" w:type="dxa"/>
+              <w:right w:w="0" w:type="dxa"/>
+            </w:tcMar>
+            <w:vAlign w:val="center"/>
+          </w:tcPr>
+          <w:p>
+            <w:pPr>
+              <w:jc w:val="left"/>
+              <w:pBdr>
+                <w:bottom w:val="none" w:sz="0" w:space="0" w:color="000000"/>
+                <w:top w:val="none" w:sz="0" w:space="0" w:color="000000"/>
+                <w:left w:val="none" w:sz="0" w:space="0" w:color="000000"/>
+                <w:right w:val="none" w:sz="0" w:space="0" w:color="000000"/>
+              </w:pBdr>
+              <w:spacing w:after="100" w:before="100" w:line="240"/>
+              <w:ind w:left="100" w:right="100" w:firstLine="0" w:firstLineChars="0"/>
+              <w:rPr>
+                <w:rFonts w:ascii="Helvetica" w:hAnsi="Helvetica" w:eastAsia="Helvetica" w:cs="Helvetica"/>
+                <w:i w:val="false"/>
+                <w:b w:val="false"/>
+                <w:u w:val="none"/>
+                <w:sz w:val="20"/>
+                <w:szCs w:val="20"/>
+                <w:color w:val="000000"/>
+              </w:rPr>
+            </w:pPr>
+            <w:r>
+              <w:rPr>
+                <w:rFonts w:ascii="Helvetica" w:hAnsi="Helvetica" w:eastAsia="Helvetica" w:cs="Helvetica"/>
+                <w:i w:val="false"/>
+                <w:b w:val="false"/>
+                <w:u w:val="none"/>
+                <w:sz w:val="20"/>
+                <w:szCs w:val="20"/>
+                <w:color w:val="000000"/>
+              </w:rPr>
+              <w:t xml:space="preserve">2013</w:t>
+            </w:r>
+          </w:p>
+        </w:tc>
+        <w:tc>
+          <w:tcPr>
+            <w:tcBorders>
+              <w:bottom w:val="none" w:sz="0" w:space="0" w:color="000000"/>
+              <w:top w:val="none" w:sz="0" w:space="0" w:color="000000"/>
+              <w:left w:val="none" w:sz="0" w:space="0" w:color="000000"/>
+              <w:right w:val="none" w:sz="0" w:space="0" w:color="000000"/>
+            </w:tcBorders>
+            <w:shd w:val="clear" w:color="auto" w:fill="FFFFFF"/>
+            <w:tcMar>
+              <w:top w:w="0" w:type="dxa"/>
+              <w:bottom w:w="0" w:type="dxa"/>
+              <w:left w:w="0" w:type="dxa"/>
+              <w:right w:w="0" w:type="dxa"/>
+            </w:tcMar>
+            <w:vAlign w:val="center"/>
+          </w:tcPr>
+          <w:p>
+            <w:pPr>
+              <w:jc w:val="center"/>
+              <w:pBdr>
+                <w:bottom w:val="none" w:sz="0" w:space="0" w:color="000000"/>
+                <w:top w:val="none" w:sz="0" w:space="0" w:color="000000"/>
+                <w:left w:val="none" w:sz="0" w:space="0" w:color="000000"/>
+                <w:right w:val="none" w:sz="0" w:space="0" w:color="000000"/>
+              </w:pBdr>
+              <w:spacing w:after="100" w:before="100" w:line="240"/>
+              <w:ind w:left="100" w:right="100" w:firstLine="0" w:firstLineChars="0"/>
+              <w:rPr>
+                <w:rFonts w:ascii="Helvetica" w:hAnsi="Helvetica" w:eastAsia="Helvetica" w:cs="Helvetica"/>
+                <w:i w:val="false"/>
+                <w:b w:val="false"/>
+                <w:u w:val="none"/>
+                <w:sz w:val="20"/>
+                <w:szCs w:val="20"/>
+                <w:color w:val="000000"/>
+              </w:rPr>
+            </w:pPr>
+            <w:r>
+              <w:rPr>
+                <w:rFonts w:ascii="Helvetica" w:hAnsi="Helvetica" w:eastAsia="Helvetica" w:cs="Helvetica"/>
+                <w:i w:val="false"/>
+                <w:b w:val="false"/>
+                <w:u w:val="none"/>
+                <w:sz w:val="20"/>
+                <w:szCs w:val="20"/>
+                <w:color w:val="000000"/>
+              </w:rPr>
               <w:t xml:space="preserve">Cameroon, Western/Central</w:t>
             </w:r>
           </w:p>
@@ -2255,7 +2573,7 @@
         <w:trPr>
           <w:trHeight w:val="577" w:hRule="auto"/>
         </w:trPr>
-        body 7
+        body 8
         <w:tc>
           <w:tcPr>
             <w:tcBorders>
@@ -2565,324 +2883,6 @@
                 <w:color w:val="000000"/>
               </w:rPr>
               <w:t xml:space="preserve">0.02</w:t>
-            </w:r>
-          </w:p>
-        </w:tc>
-      </w:tr>
-      <w:tr>
-        <w:trPr>
-          <w:trHeight w:val="617" w:hRule="auto"/>
-        </w:trPr>
-        body 8
-        <w:tc>
-          <w:tcPr>
-            <w:tcBorders>
-              <w:bottom w:val="none" w:sz="0" w:space="0" w:color="000000"/>
-              <w:top w:val="none" w:sz="0" w:space="0" w:color="000000"/>
-              <w:left w:val="none" w:sz="0" w:space="0" w:color="000000"/>
-              <w:right w:val="none" w:sz="0" w:space="0" w:color="000000"/>
-            </w:tcBorders>
-            <w:shd w:val="clear" w:color="auto" w:fill="FFFFFF"/>
-            <w:tcMar>
-              <w:top w:w="0" w:type="dxa"/>
-              <w:bottom w:w="0" w:type="dxa"/>
-              <w:left w:w="0" w:type="dxa"/>
-              <w:right w:w="0" w:type="dxa"/>
-            </w:tcMar>
-            <w:vAlign w:val="center"/>
-          </w:tcPr>
-          <w:p>
-            <w:pPr>
-              <w:jc w:val="left"/>
-              <w:pBdr>
-                <w:bottom w:val="none" w:sz="0" w:space="0" w:color="000000"/>
-                <w:top w:val="none" w:sz="0" w:space="0" w:color="000000"/>
-                <w:left w:val="none" w:sz="0" w:space="0" w:color="000000"/>
-                <w:right w:val="none" w:sz="0" w:space="0" w:color="000000"/>
-              </w:pBdr>
-              <w:spacing w:after="100" w:before="100" w:line="240"/>
-              <w:ind w:left="100" w:right="100" w:firstLine="0" w:firstLineChars="0"/>
-              <w:rPr>
-                <w:rFonts w:ascii="Helvetica" w:hAnsi="Helvetica" w:eastAsia="Helvetica" w:cs="Helvetica"/>
-                <w:i w:val="false"/>
-                <w:b w:val="false"/>
-                <w:u w:val="none"/>
-                <w:sz w:val="20"/>
-                <w:szCs w:val="20"/>
-                <w:color w:val="000000"/>
-              </w:rPr>
-            </w:pPr>
-            <w:r>
-              <w:rPr>
-                <w:rFonts w:ascii="Helvetica" w:hAnsi="Helvetica" w:eastAsia="Helvetica" w:cs="Helvetica"/>
-                <w:i w:val="false"/>
-                <w:b w:val="false"/>
-                <w:u w:val="none"/>
-                <w:sz w:val="20"/>
-                <w:szCs w:val="20"/>
-                <w:color w:val="000000"/>
-              </w:rPr>
-              <w:t xml:space="preserve">2015</w:t>
-            </w:r>
-          </w:p>
-        </w:tc>
-        <w:tc>
-          <w:tcPr>
-            <w:tcBorders>
-              <w:bottom w:val="none" w:sz="0" w:space="0" w:color="000000"/>
-              <w:top w:val="none" w:sz="0" w:space="0" w:color="000000"/>
-              <w:left w:val="none" w:sz="0" w:space="0" w:color="000000"/>
-              <w:right w:val="none" w:sz="0" w:space="0" w:color="000000"/>
-            </w:tcBorders>
-            <w:shd w:val="clear" w:color="auto" w:fill="FFFFFF"/>
-            <w:tcMar>
-              <w:top w:w="0" w:type="dxa"/>
-              <w:bottom w:w="0" w:type="dxa"/>
-              <w:left w:w="0" w:type="dxa"/>
-              <w:right w:w="0" w:type="dxa"/>
-            </w:tcMar>
-            <w:vAlign w:val="center"/>
-          </w:tcPr>
-          <w:p>
-            <w:pPr>
-              <w:jc w:val="center"/>
-              <w:pBdr>
-                <w:bottom w:val="none" w:sz="0" w:space="0" w:color="000000"/>
-                <w:top w:val="none" w:sz="0" w:space="0" w:color="000000"/>
-                <w:left w:val="none" w:sz="0" w:space="0" w:color="000000"/>
-                <w:right w:val="none" w:sz="0" w:space="0" w:color="000000"/>
-              </w:pBdr>
-              <w:spacing w:after="100" w:before="100" w:line="240"/>
-              <w:ind w:left="100" w:right="100" w:firstLine="0" w:firstLineChars="0"/>
-              <w:rPr>
-                <w:rFonts w:ascii="Helvetica" w:hAnsi="Helvetica" w:eastAsia="Helvetica" w:cs="Helvetica"/>
-                <w:i w:val="false"/>
-                <w:b w:val="false"/>
-                <w:u w:val="none"/>
-                <w:sz w:val="20"/>
-                <w:szCs w:val="20"/>
-                <w:color w:val="000000"/>
-              </w:rPr>
-            </w:pPr>
-            <w:r>
-              <w:rPr>
-                <w:rFonts w:ascii="Helvetica" w:hAnsi="Helvetica" w:eastAsia="Helvetica" w:cs="Helvetica"/>
-                <w:i w:val="false"/>
-                <w:b w:val="false"/>
-                <w:u w:val="none"/>
-                <w:sz w:val="20"/>
-                <w:szCs w:val="20"/>
-                <w:color w:val="000000"/>
-              </w:rPr>
-              <w:t xml:space="preserve">Angola</w:t>
-            </w:r>
-          </w:p>
-        </w:tc>
-        <w:tc>
-          <w:tcPr>
-            <w:tcBorders>
-              <w:bottom w:val="none" w:sz="0" w:space="0" w:color="000000"/>
-              <w:top w:val="none" w:sz="0" w:space="0" w:color="000000"/>
-              <w:left w:val="none" w:sz="0" w:space="0" w:color="000000"/>
-              <w:right w:val="none" w:sz="0" w:space="0" w:color="000000"/>
-            </w:tcBorders>
-            <w:shd w:val="clear" w:color="auto" w:fill="FFFFFF"/>
-            <w:tcMar>
-              <w:top w:w="0" w:type="dxa"/>
-              <w:bottom w:w="0" w:type="dxa"/>
-              <w:left w:w="0" w:type="dxa"/>
-              <w:right w:w="0" w:type="dxa"/>
-            </w:tcMar>
-            <w:vAlign w:val="center"/>
-          </w:tcPr>
-          <w:p>
-            <w:pPr>
-              <w:jc w:val="center"/>
-              <w:pBdr>
-                <w:bottom w:val="none" w:sz="0" w:space="0" w:color="000000"/>
-                <w:top w:val="none" w:sz="0" w:space="0" w:color="000000"/>
-                <w:left w:val="none" w:sz="0" w:space="0" w:color="000000"/>
-                <w:right w:val="none" w:sz="0" w:space="0" w:color="000000"/>
-              </w:pBdr>
-              <w:spacing w:after="100" w:before="100" w:line="240"/>
-              <w:ind w:left="100" w:right="100" w:firstLine="0" w:firstLineChars="0"/>
-              <w:rPr>
-                <w:rFonts w:ascii="Helvetica" w:hAnsi="Helvetica" w:eastAsia="Helvetica" w:cs="Helvetica"/>
-                <w:i w:val="false"/>
-                <w:b w:val="false"/>
-                <w:u w:val="none"/>
-                <w:sz w:val="20"/>
-                <w:szCs w:val="20"/>
-                <w:color w:val="000000"/>
-              </w:rPr>
-            </w:pPr>
-            <w:r>
-              <w:rPr>
-                <w:rFonts w:ascii="Helvetica" w:hAnsi="Helvetica" w:eastAsia="Helvetica" w:cs="Helvetica"/>
-                <w:i w:val="false"/>
-                <w:b w:val="false"/>
-                <w:u w:val="none"/>
-                <w:sz w:val="20"/>
-                <w:szCs w:val="20"/>
-                <w:color w:val="000000"/>
-              </w:rPr>
-              <w:t xml:space="preserve">59</w:t>
-            </w:r>
-          </w:p>
-        </w:tc>
-        <w:tc>
-          <w:tcPr>
-            <w:tcBorders>
-              <w:bottom w:val="none" w:sz="0" w:space="0" w:color="000000"/>
-              <w:top w:val="none" w:sz="0" w:space="0" w:color="000000"/>
-              <w:left w:val="none" w:sz="0" w:space="0" w:color="000000"/>
-              <w:right w:val="none" w:sz="0" w:space="0" w:color="000000"/>
-            </w:tcBorders>
-            <w:shd w:val="clear" w:color="auto" w:fill="FFFFFF"/>
-            <w:tcMar>
-              <w:top w:w="0" w:type="dxa"/>
-              <w:bottom w:w="0" w:type="dxa"/>
-              <w:left w:w="0" w:type="dxa"/>
-              <w:right w:w="0" w:type="dxa"/>
-            </w:tcMar>
-            <w:vAlign w:val="center"/>
-          </w:tcPr>
-          <w:p>
-            <w:pPr>
-              <w:jc w:val="center"/>
-              <w:pBdr>
-                <w:bottom w:val="none" w:sz="0" w:space="0" w:color="000000"/>
-                <w:top w:val="none" w:sz="0" w:space="0" w:color="000000"/>
-                <w:left w:val="none" w:sz="0" w:space="0" w:color="000000"/>
-                <w:right w:val="none" w:sz="0" w:space="0" w:color="000000"/>
-              </w:pBdr>
-              <w:spacing w:after="100" w:before="100" w:line="240"/>
-              <w:ind w:left="100" w:right="100" w:firstLine="0" w:firstLineChars="0"/>
-              <w:rPr>
-                <w:rFonts w:ascii="Helvetica" w:hAnsi="Helvetica" w:eastAsia="Helvetica" w:cs="Helvetica"/>
-                <w:i w:val="false"/>
-                <w:b w:val="false"/>
-                <w:u w:val="none"/>
-                <w:sz w:val="20"/>
-                <w:szCs w:val="20"/>
-                <w:color w:val="000000"/>
-              </w:rPr>
-            </w:pPr>
-            <w:r>
-              <w:rPr>
-                <w:rFonts w:ascii="Helvetica" w:hAnsi="Helvetica" w:eastAsia="Helvetica" w:cs="Helvetica"/>
-                <w:i w:val="false"/>
-                <w:b w:val="false"/>
-                <w:u w:val="none"/>
-                <w:sz w:val="20"/>
-                <w:szCs w:val="20"/>
-                <w:color w:val="000000"/>
-              </w:rPr>
-              <w:t xml:space="preserve">4618</w:t>
-            </w:r>
-          </w:p>
-        </w:tc>
-        <w:tc>
-          <w:tcPr>
-            <w:tcBorders>
-              <w:bottom w:val="none" w:sz="0" w:space="0" w:color="000000"/>
-              <w:top w:val="none" w:sz="0" w:space="0" w:color="000000"/>
-              <w:left w:val="none" w:sz="0" w:space="0" w:color="000000"/>
-              <w:right w:val="none" w:sz="0" w:space="0" w:color="000000"/>
-            </w:tcBorders>
-            <w:shd w:val="clear" w:color="auto" w:fill="FFFFFF"/>
-            <w:tcMar>
-              <w:top w:w="0" w:type="dxa"/>
-              <w:bottom w:w="0" w:type="dxa"/>
-              <w:left w:w="0" w:type="dxa"/>
-              <w:right w:w="0" w:type="dxa"/>
-            </w:tcMar>
-            <w:vAlign w:val="center"/>
-          </w:tcPr>
-          <w:p>
-            <w:pPr>
-              <w:jc w:val="center"/>
-              <w:pBdr>
-                <w:bottom w:val="none" w:sz="0" w:space="0" w:color="000000"/>
-                <w:top w:val="none" w:sz="0" w:space="0" w:color="000000"/>
-                <w:left w:val="none" w:sz="0" w:space="0" w:color="000000"/>
-                <w:right w:val="none" w:sz="0" w:space="0" w:color="000000"/>
-              </w:pBdr>
-              <w:spacing w:after="100" w:before="100" w:line="240"/>
-              <w:ind w:left="100" w:right="100" w:firstLine="0" w:firstLineChars="0"/>
-              <w:rPr>
-                <w:rFonts w:ascii="Helvetica" w:hAnsi="Helvetica" w:eastAsia="Helvetica" w:cs="Helvetica"/>
-                <w:i w:val="false"/>
-                <w:b w:val="false"/>
-                <w:u w:val="none"/>
-                <w:sz w:val="20"/>
-                <w:szCs w:val="20"/>
-                <w:color w:val="000000"/>
-              </w:rPr>
-            </w:pPr>
-            <w:r>
-              <w:rPr>
-                <w:rFonts w:ascii="Helvetica" w:hAnsi="Helvetica" w:eastAsia="Helvetica" w:cs="Helvetica"/>
-                <w:i w:val="false"/>
-                <w:b w:val="false"/>
-                <w:u w:val="none"/>
-                <w:sz w:val="20"/>
-                <w:szCs w:val="20"/>
-                <w:color w:val="000000"/>
-              </w:rPr>
-              <w:t xml:space="preserve">394</w:t>
-            </w:r>
-          </w:p>
-        </w:tc>
-        <w:tc>
-          <w:tcPr>
-            <w:tcBorders>
-              <w:bottom w:val="none" w:sz="0" w:space="0" w:color="000000"/>
-              <w:top w:val="none" w:sz="0" w:space="0" w:color="000000"/>
-              <w:left w:val="none" w:sz="0" w:space="0" w:color="000000"/>
-              <w:right w:val="none" w:sz="0" w:space="0" w:color="000000"/>
-            </w:tcBorders>
-            <w:shd w:val="clear" w:color="auto" w:fill="FFFFFF"/>
-            <w:tcMar>
-              <w:top w:w="0" w:type="dxa"/>
-              <w:bottom w:w="0" w:type="dxa"/>
-              <w:left w:w="0" w:type="dxa"/>
-              <w:right w:w="0" w:type="dxa"/>
-            </w:tcMar>
-            <w:vAlign w:val="center"/>
-          </w:tcPr>
-          <w:p>
-            <w:pPr>
-              <w:jc w:val="center"/>
-              <w:pBdr>
-                <w:bottom w:val="none" w:sz="0" w:space="0" w:color="000000"/>
-                <w:top w:val="none" w:sz="0" w:space="0" w:color="000000"/>
-                <w:left w:val="none" w:sz="0" w:space="0" w:color="000000"/>
-                <w:right w:val="none" w:sz="0" w:space="0" w:color="000000"/>
-              </w:pBdr>
-              <w:spacing w:after="100" w:before="100" w:line="240"/>
-              <w:ind w:left="100" w:right="100" w:firstLine="0" w:firstLineChars="0"/>
-              <w:rPr>
-                <w:rFonts w:ascii="Helvetica" w:hAnsi="Helvetica" w:eastAsia="Helvetica" w:cs="Helvetica"/>
-                <w:i w:val="false"/>
-                <w:b w:val="false"/>
-                <w:u w:val="none"/>
-                <w:sz w:val="20"/>
-                <w:szCs w:val="20"/>
-                <w:color w:val="000000"/>
-              </w:rPr>
-            </w:pPr>
-            <w:r>
-              <w:rPr>
-                <w:rFonts w:ascii="Helvetica" w:hAnsi="Helvetica" w:eastAsia="Helvetica" w:cs="Helvetica"/>
-                <w:i w:val="false"/>
-                <w:b w:val="false"/>
-                <w:u w:val="none"/>
-                <w:sz w:val="20"/>
-                <w:szCs w:val="20"/>
-                <w:color w:val="000000"/>
-              </w:rPr>
-              <w:t xml:space="preserve">0.09</w:t>
             </w:r>
           </w:p>
         </w:tc>
@@ -2940,6 +2940,324 @@
                 <w:szCs w:val="20"/>
                 <w:color w:val="000000"/>
               </w:rPr>
+              <w:t xml:space="preserve">2015</w:t>
+            </w:r>
+          </w:p>
+        </w:tc>
+        <w:tc>
+          <w:tcPr>
+            <w:tcBorders>
+              <w:bottom w:val="none" w:sz="0" w:space="0" w:color="000000"/>
+              <w:top w:val="none" w:sz="0" w:space="0" w:color="000000"/>
+              <w:left w:val="none" w:sz="0" w:space="0" w:color="000000"/>
+              <w:right w:val="none" w:sz="0" w:space="0" w:color="000000"/>
+            </w:tcBorders>
+            <w:shd w:val="clear" w:color="auto" w:fill="FFFFFF"/>
+            <w:tcMar>
+              <w:top w:w="0" w:type="dxa"/>
+              <w:bottom w:w="0" w:type="dxa"/>
+              <w:left w:w="0" w:type="dxa"/>
+              <w:right w:w="0" w:type="dxa"/>
+            </w:tcMar>
+            <w:vAlign w:val="center"/>
+          </w:tcPr>
+          <w:p>
+            <w:pPr>
+              <w:jc w:val="center"/>
+              <w:pBdr>
+                <w:bottom w:val="none" w:sz="0" w:space="0" w:color="000000"/>
+                <w:top w:val="none" w:sz="0" w:space="0" w:color="000000"/>
+                <w:left w:val="none" w:sz="0" w:space="0" w:color="000000"/>
+                <w:right w:val="none" w:sz="0" w:space="0" w:color="000000"/>
+              </w:pBdr>
+              <w:spacing w:after="100" w:before="100" w:line="240"/>
+              <w:ind w:left="100" w:right="100" w:firstLine="0" w:firstLineChars="0"/>
+              <w:rPr>
+                <w:rFonts w:ascii="Helvetica" w:hAnsi="Helvetica" w:eastAsia="Helvetica" w:cs="Helvetica"/>
+                <w:i w:val="false"/>
+                <w:b w:val="false"/>
+                <w:u w:val="none"/>
+                <w:sz w:val="20"/>
+                <w:szCs w:val="20"/>
+                <w:color w:val="000000"/>
+              </w:rPr>
+            </w:pPr>
+            <w:r>
+              <w:rPr>
+                <w:rFonts w:ascii="Helvetica" w:hAnsi="Helvetica" w:eastAsia="Helvetica" w:cs="Helvetica"/>
+                <w:i w:val="false"/>
+                <w:b w:val="false"/>
+                <w:u w:val="none"/>
+                <w:sz w:val="20"/>
+                <w:szCs w:val="20"/>
+                <w:color w:val="000000"/>
+              </w:rPr>
+              <w:t xml:space="preserve">Angola</w:t>
+            </w:r>
+          </w:p>
+        </w:tc>
+        <w:tc>
+          <w:tcPr>
+            <w:tcBorders>
+              <w:bottom w:val="none" w:sz="0" w:space="0" w:color="000000"/>
+              <w:top w:val="none" w:sz="0" w:space="0" w:color="000000"/>
+              <w:left w:val="none" w:sz="0" w:space="0" w:color="000000"/>
+              <w:right w:val="none" w:sz="0" w:space="0" w:color="000000"/>
+            </w:tcBorders>
+            <w:shd w:val="clear" w:color="auto" w:fill="FFFFFF"/>
+            <w:tcMar>
+              <w:top w:w="0" w:type="dxa"/>
+              <w:bottom w:w="0" w:type="dxa"/>
+              <w:left w:w="0" w:type="dxa"/>
+              <w:right w:w="0" w:type="dxa"/>
+            </w:tcMar>
+            <w:vAlign w:val="center"/>
+          </w:tcPr>
+          <w:p>
+            <w:pPr>
+              <w:jc w:val="center"/>
+              <w:pBdr>
+                <w:bottom w:val="none" w:sz="0" w:space="0" w:color="000000"/>
+                <w:top w:val="none" w:sz="0" w:space="0" w:color="000000"/>
+                <w:left w:val="none" w:sz="0" w:space="0" w:color="000000"/>
+                <w:right w:val="none" w:sz="0" w:space="0" w:color="000000"/>
+              </w:pBdr>
+              <w:spacing w:after="100" w:before="100" w:line="240"/>
+              <w:ind w:left="100" w:right="100" w:firstLine="0" w:firstLineChars="0"/>
+              <w:rPr>
+                <w:rFonts w:ascii="Helvetica" w:hAnsi="Helvetica" w:eastAsia="Helvetica" w:cs="Helvetica"/>
+                <w:i w:val="false"/>
+                <w:b w:val="false"/>
+                <w:u w:val="none"/>
+                <w:sz w:val="20"/>
+                <w:szCs w:val="20"/>
+                <w:color w:val="000000"/>
+              </w:rPr>
+            </w:pPr>
+            <w:r>
+              <w:rPr>
+                <w:rFonts w:ascii="Helvetica" w:hAnsi="Helvetica" w:eastAsia="Helvetica" w:cs="Helvetica"/>
+                <w:i w:val="false"/>
+                <w:b w:val="false"/>
+                <w:u w:val="none"/>
+                <w:sz w:val="20"/>
+                <w:szCs w:val="20"/>
+                <w:color w:val="000000"/>
+              </w:rPr>
+              <w:t xml:space="preserve">59</w:t>
+            </w:r>
+          </w:p>
+        </w:tc>
+        <w:tc>
+          <w:tcPr>
+            <w:tcBorders>
+              <w:bottom w:val="none" w:sz="0" w:space="0" w:color="000000"/>
+              <w:top w:val="none" w:sz="0" w:space="0" w:color="000000"/>
+              <w:left w:val="none" w:sz="0" w:space="0" w:color="000000"/>
+              <w:right w:val="none" w:sz="0" w:space="0" w:color="000000"/>
+            </w:tcBorders>
+            <w:shd w:val="clear" w:color="auto" w:fill="FFFFFF"/>
+            <w:tcMar>
+              <w:top w:w="0" w:type="dxa"/>
+              <w:bottom w:w="0" w:type="dxa"/>
+              <w:left w:w="0" w:type="dxa"/>
+              <w:right w:w="0" w:type="dxa"/>
+            </w:tcMar>
+            <w:vAlign w:val="center"/>
+          </w:tcPr>
+          <w:p>
+            <w:pPr>
+              <w:jc w:val="center"/>
+              <w:pBdr>
+                <w:bottom w:val="none" w:sz="0" w:space="0" w:color="000000"/>
+                <w:top w:val="none" w:sz="0" w:space="0" w:color="000000"/>
+                <w:left w:val="none" w:sz="0" w:space="0" w:color="000000"/>
+                <w:right w:val="none" w:sz="0" w:space="0" w:color="000000"/>
+              </w:pBdr>
+              <w:spacing w:after="100" w:before="100" w:line="240"/>
+              <w:ind w:left="100" w:right="100" w:firstLine="0" w:firstLineChars="0"/>
+              <w:rPr>
+                <w:rFonts w:ascii="Helvetica" w:hAnsi="Helvetica" w:eastAsia="Helvetica" w:cs="Helvetica"/>
+                <w:i w:val="false"/>
+                <w:b w:val="false"/>
+                <w:u w:val="none"/>
+                <w:sz w:val="20"/>
+                <w:szCs w:val="20"/>
+                <w:color w:val="000000"/>
+              </w:rPr>
+            </w:pPr>
+            <w:r>
+              <w:rPr>
+                <w:rFonts w:ascii="Helvetica" w:hAnsi="Helvetica" w:eastAsia="Helvetica" w:cs="Helvetica"/>
+                <w:i w:val="false"/>
+                <w:b w:val="false"/>
+                <w:u w:val="none"/>
+                <w:sz w:val="20"/>
+                <w:szCs w:val="20"/>
+                <w:color w:val="000000"/>
+              </w:rPr>
+              <w:t xml:space="preserve">4618</w:t>
+            </w:r>
+          </w:p>
+        </w:tc>
+        <w:tc>
+          <w:tcPr>
+            <w:tcBorders>
+              <w:bottom w:val="none" w:sz="0" w:space="0" w:color="000000"/>
+              <w:top w:val="none" w:sz="0" w:space="0" w:color="000000"/>
+              <w:left w:val="none" w:sz="0" w:space="0" w:color="000000"/>
+              <w:right w:val="none" w:sz="0" w:space="0" w:color="000000"/>
+            </w:tcBorders>
+            <w:shd w:val="clear" w:color="auto" w:fill="FFFFFF"/>
+            <w:tcMar>
+              <w:top w:w="0" w:type="dxa"/>
+              <w:bottom w:w="0" w:type="dxa"/>
+              <w:left w:w="0" w:type="dxa"/>
+              <w:right w:w="0" w:type="dxa"/>
+            </w:tcMar>
+            <w:vAlign w:val="center"/>
+          </w:tcPr>
+          <w:p>
+            <w:pPr>
+              <w:jc w:val="center"/>
+              <w:pBdr>
+                <w:bottom w:val="none" w:sz="0" w:space="0" w:color="000000"/>
+                <w:top w:val="none" w:sz="0" w:space="0" w:color="000000"/>
+                <w:left w:val="none" w:sz="0" w:space="0" w:color="000000"/>
+                <w:right w:val="none" w:sz="0" w:space="0" w:color="000000"/>
+              </w:pBdr>
+              <w:spacing w:after="100" w:before="100" w:line="240"/>
+              <w:ind w:left="100" w:right="100" w:firstLine="0" w:firstLineChars="0"/>
+              <w:rPr>
+                <w:rFonts w:ascii="Helvetica" w:hAnsi="Helvetica" w:eastAsia="Helvetica" w:cs="Helvetica"/>
+                <w:i w:val="false"/>
+                <w:b w:val="false"/>
+                <w:u w:val="none"/>
+                <w:sz w:val="20"/>
+                <w:szCs w:val="20"/>
+                <w:color w:val="000000"/>
+              </w:rPr>
+            </w:pPr>
+            <w:r>
+              <w:rPr>
+                <w:rFonts w:ascii="Helvetica" w:hAnsi="Helvetica" w:eastAsia="Helvetica" w:cs="Helvetica"/>
+                <w:i w:val="false"/>
+                <w:b w:val="false"/>
+                <w:u w:val="none"/>
+                <w:sz w:val="20"/>
+                <w:szCs w:val="20"/>
+                <w:color w:val="000000"/>
+              </w:rPr>
+              <w:t xml:space="preserve">394</w:t>
+            </w:r>
+          </w:p>
+        </w:tc>
+        <w:tc>
+          <w:tcPr>
+            <w:tcBorders>
+              <w:bottom w:val="none" w:sz="0" w:space="0" w:color="000000"/>
+              <w:top w:val="none" w:sz="0" w:space="0" w:color="000000"/>
+              <w:left w:val="none" w:sz="0" w:space="0" w:color="000000"/>
+              <w:right w:val="none" w:sz="0" w:space="0" w:color="000000"/>
+            </w:tcBorders>
+            <w:shd w:val="clear" w:color="auto" w:fill="FFFFFF"/>
+            <w:tcMar>
+              <w:top w:w="0" w:type="dxa"/>
+              <w:bottom w:w="0" w:type="dxa"/>
+              <w:left w:w="0" w:type="dxa"/>
+              <w:right w:w="0" w:type="dxa"/>
+            </w:tcMar>
+            <w:vAlign w:val="center"/>
+          </w:tcPr>
+          <w:p>
+            <w:pPr>
+              <w:jc w:val="center"/>
+              <w:pBdr>
+                <w:bottom w:val="none" w:sz="0" w:space="0" w:color="000000"/>
+                <w:top w:val="none" w:sz="0" w:space="0" w:color="000000"/>
+                <w:left w:val="none" w:sz="0" w:space="0" w:color="000000"/>
+                <w:right w:val="none" w:sz="0" w:space="0" w:color="000000"/>
+              </w:pBdr>
+              <w:spacing w:after="100" w:before="100" w:line="240"/>
+              <w:ind w:left="100" w:right="100" w:firstLine="0" w:firstLineChars="0"/>
+              <w:rPr>
+                <w:rFonts w:ascii="Helvetica" w:hAnsi="Helvetica" w:eastAsia="Helvetica" w:cs="Helvetica"/>
+                <w:i w:val="false"/>
+                <w:b w:val="false"/>
+                <w:u w:val="none"/>
+                <w:sz w:val="20"/>
+                <w:szCs w:val="20"/>
+                <w:color w:val="000000"/>
+              </w:rPr>
+            </w:pPr>
+            <w:r>
+              <w:rPr>
+                <w:rFonts w:ascii="Helvetica" w:hAnsi="Helvetica" w:eastAsia="Helvetica" w:cs="Helvetica"/>
+                <w:i w:val="false"/>
+                <w:b w:val="false"/>
+                <w:u w:val="none"/>
+                <w:sz w:val="20"/>
+                <w:szCs w:val="20"/>
+                <w:color w:val="000000"/>
+              </w:rPr>
+              <w:t xml:space="preserve">0.09</w:t>
+            </w:r>
+          </w:p>
+        </w:tc>
+      </w:tr>
+      <w:tr>
+        <w:trPr>
+          <w:trHeight w:val="617" w:hRule="auto"/>
+        </w:trPr>
+        body10
+        <w:tc>
+          <w:tcPr>
+            <w:tcBorders>
+              <w:bottom w:val="none" w:sz="0" w:space="0" w:color="000000"/>
+              <w:top w:val="none" w:sz="0" w:space="0" w:color="000000"/>
+              <w:left w:val="none" w:sz="0" w:space="0" w:color="000000"/>
+              <w:right w:val="none" w:sz="0" w:space="0" w:color="000000"/>
+            </w:tcBorders>
+            <w:shd w:val="clear" w:color="auto" w:fill="FFFFFF"/>
+            <w:tcMar>
+              <w:top w:w="0" w:type="dxa"/>
+              <w:bottom w:w="0" w:type="dxa"/>
+              <w:left w:w="0" w:type="dxa"/>
+              <w:right w:w="0" w:type="dxa"/>
+            </w:tcMar>
+            <w:vAlign w:val="center"/>
+          </w:tcPr>
+          <w:p>
+            <w:pPr>
+              <w:jc w:val="left"/>
+              <w:pBdr>
+                <w:bottom w:val="none" w:sz="0" w:space="0" w:color="000000"/>
+                <w:top w:val="none" w:sz="0" w:space="0" w:color="000000"/>
+                <w:left w:val="none" w:sz="0" w:space="0" w:color="000000"/>
+                <w:right w:val="none" w:sz="0" w:space="0" w:color="000000"/>
+              </w:pBdr>
+              <w:spacing w:after="100" w:before="100" w:line="240"/>
+              <w:ind w:left="100" w:right="100" w:firstLine="0" w:firstLineChars="0"/>
+              <w:rPr>
+                <w:rFonts w:ascii="Helvetica" w:hAnsi="Helvetica" w:eastAsia="Helvetica" w:cs="Helvetica"/>
+                <w:i w:val="false"/>
+                <w:b w:val="false"/>
+                <w:u w:val="none"/>
+                <w:sz w:val="20"/>
+                <w:szCs w:val="20"/>
+                <w:color w:val="000000"/>
+              </w:rPr>
+            </w:pPr>
+            <w:r>
+              <w:rPr>
+                <w:rFonts w:ascii="Helvetica" w:hAnsi="Helvetica" w:eastAsia="Helvetica" w:cs="Helvetica"/>
+                <w:i w:val="false"/>
+                <w:b w:val="false"/>
+                <w:u w:val="none"/>
+                <w:sz w:val="20"/>
+                <w:szCs w:val="20"/>
+                <w:color w:val="000000"/>
+              </w:rPr>
               <w:t xml:space="preserve">2017</w:t>
             </w:r>
           </w:p>
@@ -3209,7 +3527,7 @@
         <w:trPr>
           <w:trHeight w:val="621" w:hRule="auto"/>
         </w:trPr>
-        body10
+        body11
         <w:tc>
           <w:tcPr>
             <w:tcBorders>
@@ -3527,7 +3845,7 @@
         <w:trPr>
           <w:trHeight w:val="615" w:hRule="auto"/>
         </w:trPr>
-        body11
+        body12
         <w:tc>
           <w:tcPr>
             <w:tcBorders>
@@ -3845,7 +4163,7 @@
         <w:trPr>
           <w:trHeight w:val="577" w:hRule="auto"/>
         </w:trPr>
-        body12
+        body13
         <w:tc>
           <w:tcPr>
             <w:tcBorders>
@@ -4163,7 +4481,7 @@
         <w:trPr>
           <w:trHeight w:val="617" w:hRule="auto"/>
         </w:trPr>
-        body13
+        body14
         <w:tc>
           <w:tcPr>
             <w:tcBorders>
@@ -4481,7 +4799,7 @@
         <w:trPr>
           <w:trHeight w:val="615" w:hRule="auto"/>
         </w:trPr>
-        body14
+        body15
         <w:tc>
           <w:tcPr>
             <w:tcBorders>
@@ -4799,7 +5117,7 @@
         <w:trPr>
           <w:trHeight w:val="617" w:hRule="auto"/>
         </w:trPr>
-        body15
+        body16
         <w:tc>
           <w:tcPr>
             <w:tcBorders>
@@ -5117,7 +5435,7 @@
         <w:trPr>
           <w:trHeight w:val="621" w:hRule="auto"/>
         </w:trPr>
-        body16
+        body17
         <w:tc>
           <w:tcPr>
             <w:tcBorders>
@@ -5435,7 +5753,7 @@
         <w:trPr>
           <w:trHeight w:val="577" w:hRule="auto"/>
         </w:trPr>
-        body17
+        body18
         <w:tc>
           <w:tcPr>
             <w:tcBorders>
@@ -5753,7 +6071,7 @@
         <w:trPr>
           <w:trHeight w:val="616" w:hRule="auto"/>
         </w:trPr>
-        body18
+        body19
         <w:tc>
           <w:tcPr>
             <w:tcBorders>
@@ -6071,7 +6389,7 @@
         <w:trPr>
           <w:trHeight w:val="577" w:hRule="auto"/>
         </w:trPr>
-        body19
+        body20
         <w:tc>
           <w:tcPr>
             <w:tcBorders>
@@ -6439,7 +6757,7 @@
                 <w:szCs w:val="22"/>
                 <w:color w:val="000000"/>
               </w:rPr>
-              <w:t xml:space="preserve">Days: mean = 89.4; median = 80.0; mode = 17; IQR = 51.5–115.5; range = 17.0–192.0; n = 19 complete outbreaks</w:t>
+              <w:t xml:space="preserve">Days: mean = 90.5; median = 90.5; mode = 17; IQR = 53.8–113.2; range = 17.0–192.0; n = 20 complete outbreaks</w:t>
             </w:r>
           </w:p>
         </w:tc>

</xml_diff>